<commit_message>
Update WoWThreads API Entry Points.docx
Fix grammar mistakes
Document new entry points (esp metrics)
</commit_message>
<xml_diff>
--- a/Docs/WoWThreads API Entry Points.docx
+++ b/Docs/WoWThreads API Entry Points.docx
@@ -7,6 +7,1908 @@
         <w:pStyle w:val="Heading1"/>
       </w:pPr>
       <w:r>
+        <w:t>WoWThreads API Entry Points</w:t>
+      </w:r>
+    </w:p>
+    <w:p>
+      <w:r>
+        <w:t>This document provides a more or less formal description of each entry point (function call) of the WoWThreads API. This document is intended for developers of WoW Addons and assumes knowledge that users are unlikely to have.</w:t>
+      </w:r>
+    </w:p>
+    <w:p>
+      <w:r>
+        <w:t>For a brush-up on threads in general and WoWThreads specifically, see the WoW Threads Library V1.0 document in the addons docs directory.</w:t>
+      </w:r>
+      <w:r>
+        <w:br w:type="page"/>
+      </w:r>
+    </w:p>
+    <w:p>
+      <w:pPr>
+        <w:pStyle w:val="Heading1"/>
+      </w:pPr>
+      <w:r>
+        <w:lastRenderedPageBreak/>
+        <w:t>WoWProgramming Hints and Kinks</w:t>
+      </w:r>
+    </w:p>
+    <w:p>
+      <w:pPr>
+        <w:pStyle w:val="Heading2"/>
+      </w:pPr>
+      <w:r>
+        <w:t>Debugging</w:t>
+      </w:r>
+    </w:p>
+    <w:p>
+      <w:r>
+        <w:t xml:space="preserve">The library provides a service called </w:t>
+      </w:r>
+      <w:r>
+        <w:rPr>
+          <w:b/>
+          <w:bCs/>
+          <w:i/>
+          <w:iCs/>
+        </w:rPr>
+        <w:t>thread:print()</w:t>
+      </w:r>
+      <w:r>
+        <w:t>, that solves the problem of getting the location of point of interest in the file. In the code snippet, I placed a call to thread:print() at line 70 in the file ThreadTest3.lua</w:t>
+      </w:r>
+    </w:p>
+    <w:p>
+      <w:r>
+        <w:drawing>
+          <wp:inline distT="0" distB="0" distL="0" distR="0" wp14:anchorId="390A154F" wp14:editId="628AC69D">
+            <wp:extent cx="3377682" cy="2684825"/>
+            <wp:effectExtent l="0" t="0" r="0" b="1270"/>
+            <wp:docPr id="103535259" name="Picture 1"/>
+            <wp:cNvGraphicFramePr>
+              <a:graphicFrameLocks xmlns:a="http://schemas.openxmlformats.org/drawingml/2006/main" noChangeAspect="1"/>
+            </wp:cNvGraphicFramePr>
+            <a:graphic xmlns:a="http://schemas.openxmlformats.org/drawingml/2006/main">
+              <a:graphicData uri="http://schemas.openxmlformats.org/drawingml/2006/picture">
+                <pic:pic xmlns:pic="http://schemas.openxmlformats.org/drawingml/2006/picture">
+                  <pic:nvPicPr>
+                    <pic:cNvPr id="103535259" name=""/>
+                    <pic:cNvPicPr/>
+                  </pic:nvPicPr>
+                  <pic:blipFill>
+                    <a:blip r:embed="rId8"/>
+                    <a:stretch>
+                      <a:fillRect/>
+                    </a:stretch>
+                  </pic:blipFill>
+                  <pic:spPr>
+                    <a:xfrm>
+                      <a:off x="0" y="0"/>
+                      <a:ext cx="3378154" cy="2685200"/>
+                    </a:xfrm>
+                    <a:prstGeom prst="rect">
+                      <a:avLst/>
+                    </a:prstGeom>
+                  </pic:spPr>
+                </pic:pic>
+              </a:graphicData>
+            </a:graphic>
+          </wp:inline>
+        </w:drawing>
+      </w:r>
+    </w:p>
+    <w:p>
+      <w:r>
+        <w:t>Here’s what it looks like in-game.</w:t>
+      </w:r>
+    </w:p>
+    <w:p>
+      <w:r>
+        <w:drawing>
+          <wp:inline distT="0" distB="0" distL="0" distR="0" wp14:anchorId="371A616D" wp14:editId="193C839D">
+            <wp:extent cx="3834882" cy="3261945"/>
+            <wp:effectExtent l="0" t="0" r="0" b="0"/>
+            <wp:docPr id="704495897" name="Picture 1"/>
+            <wp:cNvGraphicFramePr>
+              <a:graphicFrameLocks xmlns:a="http://schemas.openxmlformats.org/drawingml/2006/main" noChangeAspect="1"/>
+            </wp:cNvGraphicFramePr>
+            <a:graphic xmlns:a="http://schemas.openxmlformats.org/drawingml/2006/main">
+              <a:graphicData uri="http://schemas.openxmlformats.org/drawingml/2006/picture">
+                <pic:pic xmlns:pic="http://schemas.openxmlformats.org/drawingml/2006/picture">
+                  <pic:nvPicPr>
+                    <pic:cNvPr id="704495897" name=""/>
+                    <pic:cNvPicPr/>
+                  </pic:nvPicPr>
+                  <pic:blipFill>
+                    <a:blip r:embed="rId9"/>
+                    <a:stretch>
+                      <a:fillRect/>
+                    </a:stretch>
+                  </pic:blipFill>
+                  <pic:spPr>
+                    <a:xfrm>
+                      <a:off x="0" y="0"/>
+                      <a:ext cx="3837354" cy="3264047"/>
+                    </a:xfrm>
+                    <a:prstGeom prst="rect">
+                      <a:avLst/>
+                    </a:prstGeom>
+                  </pic:spPr>
+                </pic:pic>
+              </a:graphicData>
+            </a:graphic>
+          </wp:inline>
+        </w:drawing>
+      </w:r>
+    </w:p>
+    <w:p>
+      <w:pPr>
+        <w:pStyle w:val="Heading2"/>
+      </w:pPr>
+      <w:r>
+        <w:lastRenderedPageBreak/>
+        <w:t>About Thread Congestion</w:t>
+      </w:r>
+    </w:p>
+    <w:p>
+      <w:r>
+        <w:t>When multiple threads from independent addons are active, thread congestion can be problematic. Thread congestion occurs when a thread’s yield time expires but is prevented from acquiring the processor because another thread is currently running. The extent to which this happens is called thread congestion and is determined by comparing the ideal</w:t>
+      </w:r>
+      <w:r>
+        <w:rPr>
+          <w:rStyle w:val="FootnoteReference"/>
+        </w:rPr>
+        <w:footnoteReference w:id="1"/>
+      </w:r>
+      <w:r>
+        <w:t xml:space="preserve"> calculated suspension time with the actual suspension time. A thread’s congestion metric is calculated as follows:</w:t>
+      </w:r>
+    </w:p>
+    <w:p>
+      <w:pPr>
+        <w:jc w:val="center"/>
+      </w:pPr>
+      <w:r>
+        <w:t>congestion</w:t>
+      </w:r>
+      <w:r>
+        <w:t xml:space="preserve">  = ((actualTimeYielded - idealTimeYielded) / actualTimeYielded)</w:t>
+      </w:r>
+    </w:p>
+    <w:p>
+      <w:r>
+        <w:t>Congestion is proportional to the thread’s yield interval and the total number of threads. For example, when I run a canned congestion test</w:t>
+      </w:r>
+      <w:r>
+        <w:rPr>
+          <w:rStyle w:val="FootnoteReference"/>
+        </w:rPr>
+        <w:footnoteReference w:id="2"/>
+      </w:r>
+    </w:p>
+    <w:p>
+      <w:pPr>
+        <w:sectPr>
+          <w:pgSz w:w="12240" w:h="15840"/>
+          <w:pgMar w:top="1440" w:right="1440" w:bottom="1440" w:left="1440" w:header="720" w:footer="720" w:gutter="0"/>
+          <w:cols w:space="720"/>
+          <w:docGrid w:linePitch="360"/>
+        </w:sectPr>
+      </w:pPr>
+      <w:r>
+        <w:drawing>
+          <wp:inline distT="0" distB="0" distL="0" distR="0" wp14:anchorId="1128FE08" wp14:editId="246DCFE4">
+            <wp:extent cx="5943600" cy="2265045"/>
+            <wp:effectExtent l="0" t="0" r="0" b="1905"/>
+            <wp:docPr id="193613562" name="Picture 1"/>
+            <wp:cNvGraphicFramePr>
+              <a:graphicFrameLocks xmlns:a="http://schemas.openxmlformats.org/drawingml/2006/main" noChangeAspect="1"/>
+            </wp:cNvGraphicFramePr>
+            <a:graphic xmlns:a="http://schemas.openxmlformats.org/drawingml/2006/main">
+              <a:graphicData uri="http://schemas.openxmlformats.org/drawingml/2006/picture">
+                <pic:pic xmlns:pic="http://schemas.openxmlformats.org/drawingml/2006/picture">
+                  <pic:nvPicPr>
+                    <pic:cNvPr id="193613562" name=""/>
+                    <pic:cNvPicPr/>
+                  </pic:nvPicPr>
+                  <pic:blipFill>
+                    <a:blip r:embed="rId10"/>
+                    <a:stretch>
+                      <a:fillRect/>
+                    </a:stretch>
+                  </pic:blipFill>
+                  <pic:spPr>
+                    <a:xfrm>
+                      <a:off x="0" y="0"/>
+                      <a:ext cx="5943600" cy="2265045"/>
+                    </a:xfrm>
+                    <a:prstGeom prst="rect">
+                      <a:avLst/>
+                    </a:prstGeom>
+                  </pic:spPr>
+                </pic:pic>
+              </a:graphicData>
+            </a:graphic>
+          </wp:inline>
+        </w:drawing>
+      </w:r>
+    </w:p>
+    <w:p>
+      <w:pPr>
+        <w:pStyle w:val="Heading1"/>
+      </w:pPr>
+      <w:r>
+        <w:lastRenderedPageBreak/>
+        <w:t xml:space="preserve">WoWThreads </w:t>
+      </w:r>
+      <w:r>
+        <w:t>Getting Started</w:t>
+      </w:r>
+    </w:p>
+    <w:p>
+      <w:r>
+        <w:t xml:space="preserve">WoWThreads is currently configured </w:t>
+      </w:r>
+      <w:r>
+        <w:t xml:space="preserve">as a </w:t>
+      </w:r>
+      <w:r>
+        <w:rPr>
+          <w:b/>
+          <w:bCs/>
+          <w:i/>
+          <w:iCs/>
+        </w:rPr>
+        <w:t>standalone, shared library</w:t>
+      </w:r>
+      <w:r>
+        <w:t xml:space="preserve"> and</w:t>
+      </w:r>
+      <w:r>
+        <w:t xml:space="preserve"> is </w:t>
+      </w:r>
+      <w:r>
+        <w:t>installed as an addon in its own right. Examine Figure 1 below.</w:t>
+      </w:r>
+    </w:p>
+    <w:p>
+      <w:pPr>
+        <w:keepNext/>
+      </w:pPr>
+      <w:r>
+        <w:drawing>
+          <wp:inline distT="0" distB="0" distL="0" distR="0" wp14:anchorId="0937865C" wp14:editId="793F6B66">
+            <wp:extent cx="5943600" cy="5704205"/>
+            <wp:effectExtent l="0" t="0" r="0" b="0"/>
+            <wp:docPr id="1976269728" name="Picture 1"/>
+            <wp:cNvGraphicFramePr>
+              <a:graphicFrameLocks xmlns:a="http://schemas.openxmlformats.org/drawingml/2006/main" noChangeAspect="1"/>
+            </wp:cNvGraphicFramePr>
+            <a:graphic xmlns:a="http://schemas.openxmlformats.org/drawingml/2006/main">
+              <a:graphicData uri="http://schemas.openxmlformats.org/drawingml/2006/picture">
+                <pic:pic xmlns:pic="http://schemas.openxmlformats.org/drawingml/2006/picture">
+                  <pic:nvPicPr>
+                    <pic:cNvPr id="1976269728" name=""/>
+                    <pic:cNvPicPr/>
+                  </pic:nvPicPr>
+                  <pic:blipFill>
+                    <a:blip r:embed="rId11"/>
+                    <a:stretch>
+                      <a:fillRect/>
+                    </a:stretch>
+                  </pic:blipFill>
+                  <pic:spPr>
+                    <a:xfrm>
+                      <a:off x="0" y="0"/>
+                      <a:ext cx="5943600" cy="5704205"/>
+                    </a:xfrm>
+                    <a:prstGeom prst="rect">
+                      <a:avLst/>
+                    </a:prstGeom>
+                  </pic:spPr>
+                </pic:pic>
+              </a:graphicData>
+            </a:graphic>
+          </wp:inline>
+        </w:drawing>
+      </w:r>
+    </w:p>
+    <w:p>
+      <w:pPr>
+        <w:pStyle w:val="Caption"/>
+      </w:pPr>
+      <w:r>
+        <w:t xml:space="preserve">Figure </w:t>
+      </w:r>
+      <w:fldSimple w:instr=" SEQ Figure \* ARABIC ">
+        <w:r>
+          <w:rPr>
+            <w:noProof/>
+          </w:rPr>
+          <w:t>1</w:t>
+        </w:r>
+      </w:fldSimple>
+      <w:r>
+        <w:t xml:space="preserve"> Addon Enable Screen</w:t>
+      </w:r>
+    </w:p>
+    <w:p>
+      <w:r>
+        <w:t>Figure 1 is a screenshot of my system using only addons I’ve written</w:t>
+      </w:r>
+      <w:r>
+        <w:rPr>
+          <w:rStyle w:val="FootnoteReference"/>
+        </w:rPr>
+        <w:footnoteReference w:id="3"/>
+      </w:r>
+      <w:r>
+        <w:t xml:space="preserve"> and a</w:t>
+      </w:r>
+      <w:r>
+        <w:t>m</w:t>
+      </w:r>
+      <w:r>
+        <w:t xml:space="preserve"> using personally. Two of these addons, TestAddonOne and TestAddonTwo, are</w:t>
+      </w:r>
+      <w:r>
+        <w:t xml:space="preserve"> </w:t>
+      </w:r>
+      <w:r>
+        <w:t xml:space="preserve">used </w:t>
+      </w:r>
+      <w:r>
+        <w:t xml:space="preserve">purely </w:t>
+      </w:r>
+      <w:r>
+        <w:t xml:space="preserve">to exercise the library. The others </w:t>
+      </w:r>
+      <w:r>
+        <w:t>have been multithreaded and running in-game for some time now – especially SkillUp and DPS_Tracker.</w:t>
+      </w:r>
+    </w:p>
+    <w:p>
+      <w:r>
+        <w:t>To use the library take the following steps:</w:t>
+      </w:r>
+    </w:p>
+    <w:p>
+      <w:pPr>
+        <w:pStyle w:val="ListParagraph"/>
+        <w:numPr>
+          <w:ilvl w:val="0"/>
+          <w:numId w:val="4"/>
+        </w:numPr>
+      </w:pPr>
+      <w:r>
+        <w:lastRenderedPageBreak/>
+        <w:t xml:space="preserve">Install the library from CurseForge. </w:t>
+      </w:r>
+    </w:p>
+    <w:p>
+      <w:pPr>
+        <w:pStyle w:val="ListParagraph"/>
+        <w:numPr>
+          <w:ilvl w:val="0"/>
+          <w:numId w:val="4"/>
+        </w:numPr>
+        <w:spacing w:after="360"/>
+      </w:pPr>
+      <w:r>
+        <w:t>Put the following code in each of your addon’s source files that will use the services of WoWThreads. Here is an example from the Main.lua file of the DPS_Tracker addon</w:t>
+      </w:r>
+    </w:p>
+    <w:p>
+      <w:pPr>
+        <w:pStyle w:val="ListParagraph"/>
+        <w:spacing w:after="360"/>
+      </w:pPr>
+    </w:p>
+    <w:p>
+      <w:pPr>
+        <w:pStyle w:val="ListParagraph"/>
+        <w:numPr>
+          <w:ilvl w:val="0"/>
+          <w:numId w:val="4"/>
+        </w:numPr>
+        <w:shd w:val="clear" w:color="auto" w:fill="1F1F1F"/>
+        <w:spacing w:before="240" w:after="0" w:line="285" w:lineRule="atLeast"/>
+        <w:rPr>
+          <w:rFonts w:ascii="Consolas" w:eastAsia="Times New Roman" w:hAnsi="Consolas" w:cs="Times New Roman"/>
+          <w:color w:val="CCCCCC"/>
+          <w:sz w:val="21"/>
+          <w:szCs w:val="21"/>
+          <w:lang w:bidi="he-IL"/>
+        </w:rPr>
+      </w:pPr>
+      <w:r>
+        <w:rPr>
+          <w:rFonts w:ascii="Consolas" w:eastAsia="Times New Roman" w:hAnsi="Consolas" w:cs="Times New Roman"/>
+          <w:color w:val="569CD6"/>
+          <w:sz w:val="21"/>
+          <w:szCs w:val="21"/>
+          <w:lang w:bidi="he-IL"/>
+        </w:rPr>
+        <w:t>local</w:t>
+      </w:r>
+      <w:r>
+        <w:rPr>
+          <w:rFonts w:ascii="Consolas" w:eastAsia="Times New Roman" w:hAnsi="Consolas" w:cs="Times New Roman"/>
+          <w:color w:val="CCCCCC"/>
+          <w:sz w:val="21"/>
+          <w:szCs w:val="21"/>
+          <w:lang w:bidi="he-IL"/>
+        </w:rPr>
+        <w:t xml:space="preserve"> </w:t>
+      </w:r>
+      <w:r>
+        <w:rPr>
+          <w:rFonts w:ascii="Consolas" w:eastAsia="Times New Roman" w:hAnsi="Consolas" w:cs="Times New Roman"/>
+          <w:color w:val="9CDCFE"/>
+          <w:sz w:val="21"/>
+          <w:szCs w:val="21"/>
+          <w:lang w:bidi="he-IL"/>
+        </w:rPr>
+        <w:t>_</w:t>
+      </w:r>
+      <w:r>
+        <w:rPr>
+          <w:rFonts w:ascii="Consolas" w:eastAsia="Times New Roman" w:hAnsi="Consolas" w:cs="Times New Roman"/>
+          <w:color w:val="CCCCCC"/>
+          <w:sz w:val="21"/>
+          <w:szCs w:val="21"/>
+          <w:lang w:bidi="he-IL"/>
+        </w:rPr>
+        <w:t xml:space="preserve">, </w:t>
+      </w:r>
+      <w:r>
+        <w:rPr>
+          <w:rFonts w:ascii="Consolas" w:eastAsia="Times New Roman" w:hAnsi="Consolas" w:cs="Times New Roman"/>
+          <w:color w:val="9CDCFE"/>
+          <w:sz w:val="21"/>
+          <w:szCs w:val="21"/>
+          <w:lang w:bidi="he-IL"/>
+        </w:rPr>
+        <w:t>DPS_Tracker</w:t>
+      </w:r>
+      <w:r>
+        <w:rPr>
+          <w:rFonts w:ascii="Consolas" w:eastAsia="Times New Roman" w:hAnsi="Consolas" w:cs="Times New Roman"/>
+          <w:color w:val="CCCCCC"/>
+          <w:sz w:val="21"/>
+          <w:szCs w:val="21"/>
+          <w:lang w:bidi="he-IL"/>
+        </w:rPr>
+        <w:t xml:space="preserve"> </w:t>
+      </w:r>
+      <w:r>
+        <w:rPr>
+          <w:rFonts w:ascii="Consolas" w:eastAsia="Times New Roman" w:hAnsi="Consolas" w:cs="Times New Roman"/>
+          <w:color w:val="D4D4D4"/>
+          <w:sz w:val="21"/>
+          <w:szCs w:val="21"/>
+          <w:lang w:bidi="he-IL"/>
+        </w:rPr>
+        <w:t>=</w:t>
+      </w:r>
+      <w:r>
+        <w:rPr>
+          <w:rFonts w:ascii="Consolas" w:eastAsia="Times New Roman" w:hAnsi="Consolas" w:cs="Times New Roman"/>
+          <w:color w:val="CCCCCC"/>
+          <w:sz w:val="21"/>
+          <w:szCs w:val="21"/>
+          <w:lang w:bidi="he-IL"/>
+        </w:rPr>
+        <w:t xml:space="preserve"> </w:t>
+      </w:r>
+      <w:r>
+        <w:rPr>
+          <w:rFonts w:ascii="Consolas" w:eastAsia="Times New Roman" w:hAnsi="Consolas" w:cs="Times New Roman"/>
+          <w:color w:val="569CD6"/>
+          <w:sz w:val="21"/>
+          <w:szCs w:val="21"/>
+          <w:lang w:bidi="he-IL"/>
+        </w:rPr>
+        <w:t>...</w:t>
+      </w:r>
+    </w:p>
+    <w:p>
+      <w:pPr>
+        <w:pStyle w:val="ListParagraph"/>
+        <w:numPr>
+          <w:ilvl w:val="0"/>
+          <w:numId w:val="4"/>
+        </w:numPr>
+        <w:shd w:val="clear" w:color="auto" w:fill="1F1F1F"/>
+        <w:spacing w:after="0" w:line="285" w:lineRule="atLeast"/>
+        <w:rPr>
+          <w:rFonts w:ascii="Consolas" w:eastAsia="Times New Roman" w:hAnsi="Consolas" w:cs="Times New Roman"/>
+          <w:color w:val="CCCCCC"/>
+          <w:sz w:val="21"/>
+          <w:szCs w:val="21"/>
+          <w:lang w:bidi="he-IL"/>
+        </w:rPr>
+      </w:pPr>
+      <w:r>
+        <w:rPr>
+          <w:rFonts w:ascii="Consolas" w:eastAsia="Times New Roman" w:hAnsi="Consolas" w:cs="Times New Roman"/>
+          <w:color w:val="9CDCFE"/>
+          <w:sz w:val="21"/>
+          <w:szCs w:val="21"/>
+          <w:lang w:bidi="he-IL"/>
+        </w:rPr>
+        <w:t>DPS_Tracker</w:t>
+      </w:r>
+      <w:r>
+        <w:rPr>
+          <w:rFonts w:ascii="Consolas" w:eastAsia="Times New Roman" w:hAnsi="Consolas" w:cs="Times New Roman"/>
+          <w:color w:val="CCCCCC"/>
+          <w:sz w:val="21"/>
+          <w:szCs w:val="21"/>
+          <w:lang w:bidi="he-IL"/>
+        </w:rPr>
+        <w:t>.</w:t>
+      </w:r>
+      <w:r>
+        <w:rPr>
+          <w:rFonts w:ascii="Consolas" w:eastAsia="Times New Roman" w:hAnsi="Consolas" w:cs="Times New Roman"/>
+          <w:color w:val="4EC9B0"/>
+          <w:sz w:val="21"/>
+          <w:szCs w:val="21"/>
+          <w:lang w:bidi="he-IL"/>
+        </w:rPr>
+        <w:t>Main</w:t>
+      </w:r>
+      <w:r>
+        <w:rPr>
+          <w:rFonts w:ascii="Consolas" w:eastAsia="Times New Roman" w:hAnsi="Consolas" w:cs="Times New Roman"/>
+          <w:color w:val="CCCCCC"/>
+          <w:sz w:val="21"/>
+          <w:szCs w:val="21"/>
+          <w:lang w:bidi="he-IL"/>
+        </w:rPr>
+        <w:t xml:space="preserve"> </w:t>
+      </w:r>
+      <w:r>
+        <w:rPr>
+          <w:rFonts w:ascii="Consolas" w:eastAsia="Times New Roman" w:hAnsi="Consolas" w:cs="Times New Roman"/>
+          <w:color w:val="D4D4D4"/>
+          <w:sz w:val="21"/>
+          <w:szCs w:val="21"/>
+          <w:lang w:bidi="he-IL"/>
+        </w:rPr>
+        <w:t>=</w:t>
+      </w:r>
+      <w:r>
+        <w:rPr>
+          <w:rFonts w:ascii="Consolas" w:eastAsia="Times New Roman" w:hAnsi="Consolas" w:cs="Times New Roman"/>
+          <w:color w:val="CCCCCC"/>
+          <w:sz w:val="21"/>
+          <w:szCs w:val="21"/>
+          <w:lang w:bidi="he-IL"/>
+        </w:rPr>
+        <w:t xml:space="preserve"> {}</w:t>
+      </w:r>
+    </w:p>
+    <w:p>
+      <w:pPr>
+        <w:pStyle w:val="ListParagraph"/>
+        <w:numPr>
+          <w:ilvl w:val="0"/>
+          <w:numId w:val="4"/>
+        </w:numPr>
+        <w:shd w:val="clear" w:color="auto" w:fill="1F1F1F"/>
+        <w:spacing w:after="0" w:line="285" w:lineRule="atLeast"/>
+        <w:rPr>
+          <w:rFonts w:ascii="Consolas" w:eastAsia="Times New Roman" w:hAnsi="Consolas" w:cs="Times New Roman"/>
+          <w:color w:val="CCCCCC"/>
+          <w:sz w:val="21"/>
+          <w:szCs w:val="21"/>
+          <w:lang w:bidi="he-IL"/>
+        </w:rPr>
+      </w:pPr>
+      <w:r>
+        <w:rPr>
+          <w:rFonts w:ascii="Consolas" w:eastAsia="Times New Roman" w:hAnsi="Consolas" w:cs="Times New Roman"/>
+          <w:color w:val="9CDCFE"/>
+          <w:sz w:val="21"/>
+          <w:szCs w:val="21"/>
+          <w:lang w:bidi="he-IL"/>
+        </w:rPr>
+        <w:t>main</w:t>
+      </w:r>
+      <w:r>
+        <w:rPr>
+          <w:rFonts w:ascii="Consolas" w:eastAsia="Times New Roman" w:hAnsi="Consolas" w:cs="Times New Roman"/>
+          <w:color w:val="CCCCCC"/>
+          <w:sz w:val="21"/>
+          <w:szCs w:val="21"/>
+          <w:lang w:bidi="he-IL"/>
+        </w:rPr>
+        <w:t xml:space="preserve"> </w:t>
+      </w:r>
+      <w:r>
+        <w:rPr>
+          <w:rFonts w:ascii="Consolas" w:eastAsia="Times New Roman" w:hAnsi="Consolas" w:cs="Times New Roman"/>
+          <w:color w:val="D4D4D4"/>
+          <w:sz w:val="21"/>
+          <w:szCs w:val="21"/>
+          <w:lang w:bidi="he-IL"/>
+        </w:rPr>
+        <w:t>=</w:t>
+      </w:r>
+      <w:r>
+        <w:rPr>
+          <w:rFonts w:ascii="Consolas" w:eastAsia="Times New Roman" w:hAnsi="Consolas" w:cs="Times New Roman"/>
+          <w:color w:val="CCCCCC"/>
+          <w:sz w:val="21"/>
+          <w:szCs w:val="21"/>
+          <w:lang w:bidi="he-IL"/>
+        </w:rPr>
+        <w:t xml:space="preserve"> </w:t>
+      </w:r>
+      <w:r>
+        <w:rPr>
+          <w:rFonts w:ascii="Consolas" w:eastAsia="Times New Roman" w:hAnsi="Consolas" w:cs="Times New Roman"/>
+          <w:color w:val="9CDCFE"/>
+          <w:sz w:val="21"/>
+          <w:szCs w:val="21"/>
+          <w:lang w:bidi="he-IL"/>
+        </w:rPr>
+        <w:t>DPS_Tracker</w:t>
+      </w:r>
+      <w:r>
+        <w:rPr>
+          <w:rFonts w:ascii="Consolas" w:eastAsia="Times New Roman" w:hAnsi="Consolas" w:cs="Times New Roman"/>
+          <w:color w:val="CCCCCC"/>
+          <w:sz w:val="21"/>
+          <w:szCs w:val="21"/>
+          <w:lang w:bidi="he-IL"/>
+        </w:rPr>
+        <w:t>.</w:t>
+      </w:r>
+      <w:r>
+        <w:rPr>
+          <w:rFonts w:ascii="Consolas" w:eastAsia="Times New Roman" w:hAnsi="Consolas" w:cs="Times New Roman"/>
+          <w:color w:val="4EC9B0"/>
+          <w:sz w:val="21"/>
+          <w:szCs w:val="21"/>
+          <w:lang w:bidi="he-IL"/>
+        </w:rPr>
+        <w:t>Main</w:t>
+      </w:r>
+    </w:p>
+    <w:p>
+      <w:pPr>
+        <w:pStyle w:val="ListParagraph"/>
+        <w:numPr>
+          <w:ilvl w:val="0"/>
+          <w:numId w:val="4"/>
+        </w:numPr>
+        <w:shd w:val="clear" w:color="auto" w:fill="1F1F1F"/>
+        <w:spacing w:after="0" w:line="285" w:lineRule="atLeast"/>
+        <w:rPr>
+          <w:rFonts w:ascii="Consolas" w:eastAsia="Times New Roman" w:hAnsi="Consolas" w:cs="Times New Roman"/>
+          <w:color w:val="CCCCCC"/>
+          <w:sz w:val="21"/>
+          <w:szCs w:val="21"/>
+          <w:lang w:bidi="he-IL"/>
+        </w:rPr>
+      </w:pPr>
+    </w:p>
+    <w:p>
+      <w:pPr>
+        <w:pStyle w:val="ListParagraph"/>
+        <w:numPr>
+          <w:ilvl w:val="0"/>
+          <w:numId w:val="4"/>
+        </w:numPr>
+        <w:shd w:val="clear" w:color="auto" w:fill="1F1F1F"/>
+        <w:spacing w:after="0" w:line="285" w:lineRule="atLeast"/>
+        <w:rPr>
+          <w:rFonts w:ascii="Consolas" w:eastAsia="Times New Roman" w:hAnsi="Consolas" w:cs="Times New Roman"/>
+          <w:color w:val="CCCCCC"/>
+          <w:sz w:val="21"/>
+          <w:szCs w:val="21"/>
+          <w:lang w:bidi="he-IL"/>
+        </w:rPr>
+      </w:pPr>
+      <w:r>
+        <w:rPr>
+          <w:rFonts w:ascii="Consolas" w:eastAsia="Times New Roman" w:hAnsi="Consolas" w:cs="Times New Roman"/>
+          <w:color w:val="569CD6"/>
+          <w:sz w:val="21"/>
+          <w:szCs w:val="21"/>
+          <w:lang w:bidi="he-IL"/>
+        </w:rPr>
+        <w:t>local</w:t>
+      </w:r>
+      <w:r>
+        <w:rPr>
+          <w:rFonts w:ascii="Consolas" w:eastAsia="Times New Roman" w:hAnsi="Consolas" w:cs="Times New Roman"/>
+          <w:color w:val="CCCCCC"/>
+          <w:sz w:val="21"/>
+          <w:szCs w:val="21"/>
+          <w:lang w:bidi="he-IL"/>
+        </w:rPr>
+        <w:t xml:space="preserve"> </w:t>
+      </w:r>
+      <w:r>
+        <w:rPr>
+          <w:rFonts w:ascii="Consolas" w:eastAsia="Times New Roman" w:hAnsi="Consolas" w:cs="Times New Roman"/>
+          <w:color w:val="9CDCFE"/>
+          <w:sz w:val="21"/>
+          <w:szCs w:val="21"/>
+          <w:lang w:bidi="he-IL"/>
+        </w:rPr>
+        <w:t>libName</w:t>
+      </w:r>
+      <w:r>
+        <w:rPr>
+          <w:rFonts w:ascii="Consolas" w:eastAsia="Times New Roman" w:hAnsi="Consolas" w:cs="Times New Roman"/>
+          <w:color w:val="CCCCCC"/>
+          <w:sz w:val="21"/>
+          <w:szCs w:val="21"/>
+          <w:lang w:bidi="he-IL"/>
+        </w:rPr>
+        <w:t xml:space="preserve"> </w:t>
+      </w:r>
+      <w:r>
+        <w:rPr>
+          <w:rFonts w:ascii="Consolas" w:eastAsia="Times New Roman" w:hAnsi="Consolas" w:cs="Times New Roman"/>
+          <w:color w:val="D4D4D4"/>
+          <w:sz w:val="21"/>
+          <w:szCs w:val="21"/>
+          <w:lang w:bidi="he-IL"/>
+        </w:rPr>
+        <w:t>=</w:t>
+      </w:r>
+      <w:r>
+        <w:rPr>
+          <w:rFonts w:ascii="Consolas" w:eastAsia="Times New Roman" w:hAnsi="Consolas" w:cs="Times New Roman"/>
+          <w:color w:val="CE9178"/>
+          <w:sz w:val="21"/>
+          <w:szCs w:val="21"/>
+          <w:lang w:bidi="he-IL"/>
+        </w:rPr>
+        <w:t>"WoWThreads-1.0"</w:t>
+      </w:r>
+    </w:p>
+    <w:p>
+      <w:pPr>
+        <w:pStyle w:val="ListParagraph"/>
+        <w:numPr>
+          <w:ilvl w:val="0"/>
+          <w:numId w:val="4"/>
+        </w:numPr>
+        <w:shd w:val="clear" w:color="auto" w:fill="1F1F1F"/>
+        <w:spacing w:after="0" w:line="285" w:lineRule="atLeast"/>
+        <w:rPr>
+          <w:rFonts w:ascii="Consolas" w:eastAsia="Times New Roman" w:hAnsi="Consolas" w:cs="Times New Roman"/>
+          <w:color w:val="CCCCCC"/>
+          <w:sz w:val="21"/>
+          <w:szCs w:val="21"/>
+          <w:lang w:bidi="he-IL"/>
+        </w:rPr>
+      </w:pPr>
+      <w:r>
+        <w:rPr>
+          <w:rFonts w:ascii="Consolas" w:eastAsia="Times New Roman" w:hAnsi="Consolas" w:cs="Times New Roman"/>
+          <w:color w:val="569CD6"/>
+          <w:sz w:val="21"/>
+          <w:szCs w:val="21"/>
+          <w:lang w:bidi="he-IL"/>
+        </w:rPr>
+        <w:t>local</w:t>
+      </w:r>
+      <w:r>
+        <w:rPr>
+          <w:rFonts w:ascii="Consolas" w:eastAsia="Times New Roman" w:hAnsi="Consolas" w:cs="Times New Roman"/>
+          <w:color w:val="CCCCCC"/>
+          <w:sz w:val="21"/>
+          <w:szCs w:val="21"/>
+          <w:lang w:bidi="he-IL"/>
+        </w:rPr>
+        <w:t xml:space="preserve"> </w:t>
+      </w:r>
+      <w:r>
+        <w:rPr>
+          <w:rFonts w:ascii="Consolas" w:eastAsia="Times New Roman" w:hAnsi="Consolas" w:cs="Times New Roman"/>
+          <w:color w:val="9CDCFE"/>
+          <w:sz w:val="21"/>
+          <w:szCs w:val="21"/>
+          <w:lang w:bidi="he-IL"/>
+        </w:rPr>
+        <w:t>thread</w:t>
+      </w:r>
+      <w:r>
+        <w:rPr>
+          <w:rFonts w:ascii="Consolas" w:eastAsia="Times New Roman" w:hAnsi="Consolas" w:cs="Times New Roman"/>
+          <w:color w:val="CCCCCC"/>
+          <w:sz w:val="21"/>
+          <w:szCs w:val="21"/>
+          <w:lang w:bidi="he-IL"/>
+        </w:rPr>
+        <w:t xml:space="preserve"> </w:t>
+      </w:r>
+      <w:r>
+        <w:rPr>
+          <w:rFonts w:ascii="Consolas" w:eastAsia="Times New Roman" w:hAnsi="Consolas" w:cs="Times New Roman"/>
+          <w:color w:val="D4D4D4"/>
+          <w:sz w:val="21"/>
+          <w:szCs w:val="21"/>
+          <w:lang w:bidi="he-IL"/>
+        </w:rPr>
+        <w:t>=</w:t>
+      </w:r>
+      <w:r>
+        <w:rPr>
+          <w:rFonts w:ascii="Consolas" w:eastAsia="Times New Roman" w:hAnsi="Consolas" w:cs="Times New Roman"/>
+          <w:color w:val="CCCCCC"/>
+          <w:sz w:val="21"/>
+          <w:szCs w:val="21"/>
+          <w:lang w:bidi="he-IL"/>
+        </w:rPr>
+        <w:t xml:space="preserve"> </w:t>
+      </w:r>
+      <w:r>
+        <w:rPr>
+          <w:rFonts w:ascii="Consolas" w:eastAsia="Times New Roman" w:hAnsi="Consolas" w:cs="Times New Roman"/>
+          <w:color w:val="4EC9B0"/>
+          <w:sz w:val="21"/>
+          <w:szCs w:val="21"/>
+          <w:lang w:bidi="he-IL"/>
+        </w:rPr>
+        <w:t>LibStub</w:t>
+      </w:r>
+      <w:r>
+        <w:rPr>
+          <w:rFonts w:ascii="Consolas" w:eastAsia="Times New Roman" w:hAnsi="Consolas" w:cs="Times New Roman"/>
+          <w:color w:val="CCCCCC"/>
+          <w:sz w:val="21"/>
+          <w:szCs w:val="21"/>
+          <w:lang w:bidi="he-IL"/>
+        </w:rPr>
+        <w:t>:</w:t>
+      </w:r>
+      <w:r>
+        <w:rPr>
+          <w:rFonts w:ascii="Consolas" w:eastAsia="Times New Roman" w:hAnsi="Consolas" w:cs="Times New Roman"/>
+          <w:color w:val="DCDCAA"/>
+          <w:sz w:val="21"/>
+          <w:szCs w:val="21"/>
+          <w:lang w:bidi="he-IL"/>
+        </w:rPr>
+        <w:t>GetLibrary</w:t>
+      </w:r>
+      <w:r>
+        <w:rPr>
+          <w:rFonts w:ascii="Consolas" w:eastAsia="Times New Roman" w:hAnsi="Consolas" w:cs="Times New Roman"/>
+          <w:color w:val="CCCCCC"/>
+          <w:sz w:val="21"/>
+          <w:szCs w:val="21"/>
+          <w:lang w:bidi="he-IL"/>
+        </w:rPr>
+        <w:t xml:space="preserve">( </w:t>
+      </w:r>
+      <w:r>
+        <w:rPr>
+          <w:rFonts w:ascii="Consolas" w:eastAsia="Times New Roman" w:hAnsi="Consolas" w:cs="Times New Roman"/>
+          <w:color w:val="9CDCFE"/>
+          <w:sz w:val="21"/>
+          <w:szCs w:val="21"/>
+          <w:lang w:bidi="he-IL"/>
+        </w:rPr>
+        <w:t>libName</w:t>
+      </w:r>
+      <w:r>
+        <w:rPr>
+          <w:rFonts w:ascii="Consolas" w:eastAsia="Times New Roman" w:hAnsi="Consolas" w:cs="Times New Roman"/>
+          <w:color w:val="CCCCCC"/>
+          <w:sz w:val="21"/>
+          <w:szCs w:val="21"/>
+          <w:lang w:bidi="he-IL"/>
+        </w:rPr>
+        <w:t xml:space="preserve"> )</w:t>
+      </w:r>
+    </w:p>
+    <w:p>
+      <w:pPr>
+        <w:pStyle w:val="ListParagraph"/>
+        <w:numPr>
+          <w:ilvl w:val="0"/>
+          <w:numId w:val="4"/>
+        </w:numPr>
+        <w:shd w:val="clear" w:color="auto" w:fill="1F1F1F"/>
+        <w:spacing w:after="0" w:line="285" w:lineRule="atLeast"/>
+        <w:rPr>
+          <w:rFonts w:ascii="Consolas" w:eastAsia="Times New Roman" w:hAnsi="Consolas" w:cs="Times New Roman"/>
+          <w:color w:val="CCCCCC"/>
+          <w:sz w:val="21"/>
+          <w:szCs w:val="21"/>
+          <w:lang w:bidi="he-IL"/>
+        </w:rPr>
+      </w:pPr>
+      <w:r>
+        <w:rPr>
+          <w:rFonts w:ascii="Consolas" w:eastAsia="Times New Roman" w:hAnsi="Consolas" w:cs="Times New Roman"/>
+          <w:color w:val="C586C0"/>
+          <w:sz w:val="21"/>
+          <w:szCs w:val="21"/>
+          <w:lang w:bidi="he-IL"/>
+        </w:rPr>
+        <w:t>if</w:t>
+      </w:r>
+      <w:r>
+        <w:rPr>
+          <w:rFonts w:ascii="Consolas" w:eastAsia="Times New Roman" w:hAnsi="Consolas" w:cs="Times New Roman"/>
+          <w:color w:val="CCCCCC"/>
+          <w:sz w:val="21"/>
+          <w:szCs w:val="21"/>
+          <w:lang w:bidi="he-IL"/>
+        </w:rPr>
+        <w:t xml:space="preserve"> </w:t>
+      </w:r>
+      <w:r>
+        <w:rPr>
+          <w:rFonts w:ascii="Consolas" w:eastAsia="Times New Roman" w:hAnsi="Consolas" w:cs="Times New Roman"/>
+          <w:color w:val="D4D4D4"/>
+          <w:sz w:val="21"/>
+          <w:szCs w:val="21"/>
+          <w:lang w:bidi="he-IL"/>
+        </w:rPr>
+        <w:t>not</w:t>
+      </w:r>
+      <w:r>
+        <w:rPr>
+          <w:rFonts w:ascii="Consolas" w:eastAsia="Times New Roman" w:hAnsi="Consolas" w:cs="Times New Roman"/>
+          <w:color w:val="CCCCCC"/>
+          <w:sz w:val="21"/>
+          <w:szCs w:val="21"/>
+          <w:lang w:bidi="he-IL"/>
+        </w:rPr>
+        <w:t xml:space="preserve"> </w:t>
+      </w:r>
+      <w:r>
+        <w:rPr>
+          <w:rFonts w:ascii="Consolas" w:eastAsia="Times New Roman" w:hAnsi="Consolas" w:cs="Times New Roman"/>
+          <w:color w:val="9CDCFE"/>
+          <w:sz w:val="21"/>
+          <w:szCs w:val="21"/>
+          <w:lang w:bidi="he-IL"/>
+        </w:rPr>
+        <w:t>thread</w:t>
+      </w:r>
+      <w:r>
+        <w:rPr>
+          <w:rFonts w:ascii="Consolas" w:eastAsia="Times New Roman" w:hAnsi="Consolas" w:cs="Times New Roman"/>
+          <w:color w:val="CCCCCC"/>
+          <w:sz w:val="21"/>
+          <w:szCs w:val="21"/>
+          <w:lang w:bidi="he-IL"/>
+        </w:rPr>
+        <w:t xml:space="preserve"> </w:t>
+      </w:r>
+      <w:r>
+        <w:rPr>
+          <w:rFonts w:ascii="Consolas" w:eastAsia="Times New Roman" w:hAnsi="Consolas" w:cs="Times New Roman"/>
+          <w:color w:val="C586C0"/>
+          <w:sz w:val="21"/>
+          <w:szCs w:val="21"/>
+          <w:lang w:bidi="he-IL"/>
+        </w:rPr>
+        <w:t>then</w:t>
+      </w:r>
+      <w:r>
+        <w:rPr>
+          <w:rFonts w:ascii="Consolas" w:eastAsia="Times New Roman" w:hAnsi="Consolas" w:cs="Times New Roman"/>
+          <w:color w:val="CCCCCC"/>
+          <w:sz w:val="21"/>
+          <w:szCs w:val="21"/>
+          <w:lang w:bidi="he-IL"/>
+        </w:rPr>
+        <w:t xml:space="preserve"> </w:t>
+      </w:r>
+    </w:p>
+    <w:p>
+      <w:pPr>
+        <w:pStyle w:val="ListParagraph"/>
+        <w:numPr>
+          <w:ilvl w:val="0"/>
+          <w:numId w:val="4"/>
+        </w:numPr>
+        <w:shd w:val="clear" w:color="auto" w:fill="1F1F1F"/>
+        <w:spacing w:after="0" w:line="285" w:lineRule="atLeast"/>
+        <w:rPr>
+          <w:rFonts w:ascii="Consolas" w:eastAsia="Times New Roman" w:hAnsi="Consolas" w:cs="Times New Roman"/>
+          <w:color w:val="CCCCCC"/>
+          <w:sz w:val="21"/>
+          <w:szCs w:val="21"/>
+          <w:lang w:bidi="he-IL"/>
+        </w:rPr>
+      </w:pPr>
+      <w:r>
+        <w:rPr>
+          <w:rFonts w:ascii="Consolas" w:eastAsia="Times New Roman" w:hAnsi="Consolas" w:cs="Times New Roman"/>
+          <w:color w:val="CCCCCC"/>
+          <w:sz w:val="21"/>
+          <w:szCs w:val="21"/>
+          <w:lang w:bidi="he-IL"/>
+        </w:rPr>
+        <w:t xml:space="preserve">    </w:t>
+      </w:r>
+      <w:r>
+        <w:rPr>
+          <w:rFonts w:ascii="Consolas" w:eastAsia="Times New Roman" w:hAnsi="Consolas" w:cs="Times New Roman"/>
+          <w:color w:val="C586C0"/>
+          <w:sz w:val="21"/>
+          <w:szCs w:val="21"/>
+          <w:lang w:bidi="he-IL"/>
+        </w:rPr>
+        <w:t>return</w:t>
+      </w:r>
+      <w:r>
+        <w:rPr>
+          <w:rFonts w:ascii="Consolas" w:eastAsia="Times New Roman" w:hAnsi="Consolas" w:cs="Times New Roman"/>
+          <w:color w:val="CCCCCC"/>
+          <w:sz w:val="21"/>
+          <w:szCs w:val="21"/>
+          <w:lang w:bidi="he-IL"/>
+        </w:rPr>
+        <w:t xml:space="preserve"> </w:t>
+      </w:r>
+    </w:p>
+    <w:p>
+      <w:pPr>
+        <w:pStyle w:val="ListParagraph"/>
+        <w:numPr>
+          <w:ilvl w:val="0"/>
+          <w:numId w:val="4"/>
+        </w:numPr>
+        <w:shd w:val="clear" w:color="auto" w:fill="1F1F1F"/>
+        <w:spacing w:after="0" w:line="285" w:lineRule="atLeast"/>
+        <w:rPr>
+          <w:rFonts w:ascii="Consolas" w:eastAsia="Times New Roman" w:hAnsi="Consolas" w:cs="Times New Roman"/>
+          <w:color w:val="CCCCCC"/>
+          <w:sz w:val="21"/>
+          <w:szCs w:val="21"/>
+          <w:lang w:bidi="he-IL"/>
+        </w:rPr>
+      </w:pPr>
+      <w:r>
+        <w:rPr>
+          <w:rFonts w:ascii="Consolas" w:eastAsia="Times New Roman" w:hAnsi="Consolas" w:cs="Times New Roman"/>
+          <w:color w:val="C586C0"/>
+          <w:sz w:val="21"/>
+          <w:szCs w:val="21"/>
+          <w:lang w:bidi="he-IL"/>
+        </w:rPr>
+        <w:t>end</w:t>
+      </w:r>
+    </w:p>
+    <w:p>
+      <w:pPr>
+        <w:pStyle w:val="ListParagraph"/>
+        <w:numPr>
+          <w:ilvl w:val="0"/>
+          <w:numId w:val="4"/>
+        </w:numPr>
+        <w:shd w:val="clear" w:color="auto" w:fill="1F1F1F"/>
+        <w:spacing w:after="0" w:line="285" w:lineRule="atLeast"/>
+        <w:rPr>
+          <w:rFonts w:ascii="Consolas" w:eastAsia="Times New Roman" w:hAnsi="Consolas" w:cs="Times New Roman"/>
+          <w:color w:val="CCCCCC"/>
+          <w:sz w:val="21"/>
+          <w:szCs w:val="21"/>
+          <w:lang w:bidi="he-IL"/>
+        </w:rPr>
+      </w:pPr>
+      <w:r>
+        <w:rPr>
+          <w:rFonts w:ascii="Consolas" w:eastAsia="Times New Roman" w:hAnsi="Consolas" w:cs="Times New Roman"/>
+          <w:color w:val="569CD6"/>
+          <w:sz w:val="21"/>
+          <w:szCs w:val="21"/>
+          <w:lang w:bidi="he-IL"/>
+        </w:rPr>
+        <w:t>local</w:t>
+      </w:r>
+      <w:r>
+        <w:rPr>
+          <w:rFonts w:ascii="Consolas" w:eastAsia="Times New Roman" w:hAnsi="Consolas" w:cs="Times New Roman"/>
+          <w:color w:val="CCCCCC"/>
+          <w:sz w:val="21"/>
+          <w:szCs w:val="21"/>
+          <w:lang w:bidi="he-IL"/>
+        </w:rPr>
+        <w:t xml:space="preserve"> </w:t>
+      </w:r>
+      <w:r>
+        <w:rPr>
+          <w:rFonts w:ascii="Consolas" w:eastAsia="Times New Roman" w:hAnsi="Consolas" w:cs="Times New Roman"/>
+          <w:color w:val="9CDCFE"/>
+          <w:sz w:val="21"/>
+          <w:szCs w:val="21"/>
+          <w:lang w:bidi="he-IL"/>
+        </w:rPr>
+        <w:t>SIG_ALERT</w:t>
+      </w:r>
+      <w:r>
+        <w:rPr>
+          <w:rFonts w:ascii="Consolas" w:eastAsia="Times New Roman" w:hAnsi="Consolas" w:cs="Times New Roman"/>
+          <w:color w:val="CCCCCC"/>
+          <w:sz w:val="21"/>
+          <w:szCs w:val="21"/>
+          <w:lang w:bidi="he-IL"/>
+        </w:rPr>
+        <w:t xml:space="preserve">             </w:t>
+      </w:r>
+      <w:r>
+        <w:rPr>
+          <w:rFonts w:ascii="Consolas" w:eastAsia="Times New Roman" w:hAnsi="Consolas" w:cs="Times New Roman"/>
+          <w:color w:val="D4D4D4"/>
+          <w:sz w:val="21"/>
+          <w:szCs w:val="21"/>
+          <w:lang w:bidi="he-IL"/>
+        </w:rPr>
+        <w:t>=</w:t>
+      </w:r>
+      <w:r>
+        <w:rPr>
+          <w:rFonts w:ascii="Consolas" w:eastAsia="Times New Roman" w:hAnsi="Consolas" w:cs="Times New Roman"/>
+          <w:color w:val="CCCCCC"/>
+          <w:sz w:val="21"/>
+          <w:szCs w:val="21"/>
+          <w:lang w:bidi="he-IL"/>
+        </w:rPr>
+        <w:t xml:space="preserve"> </w:t>
+      </w:r>
+      <w:r>
+        <w:rPr>
+          <w:rFonts w:ascii="Consolas" w:eastAsia="Times New Roman" w:hAnsi="Consolas" w:cs="Times New Roman"/>
+          <w:color w:val="9CDCFE"/>
+          <w:sz w:val="21"/>
+          <w:szCs w:val="21"/>
+          <w:lang w:bidi="he-IL"/>
+        </w:rPr>
+        <w:t>thread</w:t>
+      </w:r>
+      <w:r>
+        <w:rPr>
+          <w:rFonts w:ascii="Consolas" w:eastAsia="Times New Roman" w:hAnsi="Consolas" w:cs="Times New Roman"/>
+          <w:color w:val="CCCCCC"/>
+          <w:sz w:val="21"/>
+          <w:szCs w:val="21"/>
+          <w:lang w:bidi="he-IL"/>
+        </w:rPr>
+        <w:t>.</w:t>
+      </w:r>
+      <w:r>
+        <w:rPr>
+          <w:rFonts w:ascii="Consolas" w:eastAsia="Times New Roman" w:hAnsi="Consolas" w:cs="Times New Roman"/>
+          <w:color w:val="4EC9B0"/>
+          <w:sz w:val="21"/>
+          <w:szCs w:val="21"/>
+          <w:lang w:bidi="he-IL"/>
+        </w:rPr>
+        <w:t>SIG_ALERT</w:t>
+      </w:r>
+    </w:p>
+    <w:p>
+      <w:pPr>
+        <w:pStyle w:val="ListParagraph"/>
+        <w:numPr>
+          <w:ilvl w:val="0"/>
+          <w:numId w:val="4"/>
+        </w:numPr>
+        <w:shd w:val="clear" w:color="auto" w:fill="1F1F1F"/>
+        <w:spacing w:after="0" w:line="285" w:lineRule="atLeast"/>
+        <w:rPr>
+          <w:rFonts w:ascii="Consolas" w:eastAsia="Times New Roman" w:hAnsi="Consolas" w:cs="Times New Roman"/>
+          <w:color w:val="CCCCCC"/>
+          <w:sz w:val="21"/>
+          <w:szCs w:val="21"/>
+          <w:lang w:bidi="he-IL"/>
+        </w:rPr>
+      </w:pPr>
+      <w:r>
+        <w:rPr>
+          <w:rFonts w:ascii="Consolas" w:eastAsia="Times New Roman" w:hAnsi="Consolas" w:cs="Times New Roman"/>
+          <w:color w:val="569CD6"/>
+          <w:sz w:val="21"/>
+          <w:szCs w:val="21"/>
+          <w:lang w:bidi="he-IL"/>
+        </w:rPr>
+        <w:t>local</w:t>
+      </w:r>
+      <w:r>
+        <w:rPr>
+          <w:rFonts w:ascii="Consolas" w:eastAsia="Times New Roman" w:hAnsi="Consolas" w:cs="Times New Roman"/>
+          <w:color w:val="CCCCCC"/>
+          <w:sz w:val="21"/>
+          <w:szCs w:val="21"/>
+          <w:lang w:bidi="he-IL"/>
+        </w:rPr>
+        <w:t xml:space="preserve"> </w:t>
+      </w:r>
+      <w:r>
+        <w:rPr>
+          <w:rFonts w:ascii="Consolas" w:eastAsia="Times New Roman" w:hAnsi="Consolas" w:cs="Times New Roman"/>
+          <w:color w:val="9CDCFE"/>
+          <w:sz w:val="21"/>
+          <w:szCs w:val="21"/>
+          <w:lang w:bidi="he-IL"/>
+        </w:rPr>
+        <w:t>SIG_JOIN_DATA_READY</w:t>
+      </w:r>
+      <w:r>
+        <w:rPr>
+          <w:rFonts w:ascii="Consolas" w:eastAsia="Times New Roman" w:hAnsi="Consolas" w:cs="Times New Roman"/>
+          <w:color w:val="CCCCCC"/>
+          <w:sz w:val="21"/>
+          <w:szCs w:val="21"/>
+          <w:lang w:bidi="he-IL"/>
+        </w:rPr>
+        <w:t xml:space="preserve">   </w:t>
+      </w:r>
+      <w:r>
+        <w:rPr>
+          <w:rFonts w:ascii="Consolas" w:eastAsia="Times New Roman" w:hAnsi="Consolas" w:cs="Times New Roman"/>
+          <w:color w:val="D4D4D4"/>
+          <w:sz w:val="21"/>
+          <w:szCs w:val="21"/>
+          <w:lang w:bidi="he-IL"/>
+        </w:rPr>
+        <w:t>=</w:t>
+      </w:r>
+      <w:r>
+        <w:rPr>
+          <w:rFonts w:ascii="Consolas" w:eastAsia="Times New Roman" w:hAnsi="Consolas" w:cs="Times New Roman"/>
+          <w:color w:val="CCCCCC"/>
+          <w:sz w:val="21"/>
+          <w:szCs w:val="21"/>
+          <w:lang w:bidi="he-IL"/>
+        </w:rPr>
+        <w:t xml:space="preserve"> </w:t>
+      </w:r>
+      <w:r>
+        <w:rPr>
+          <w:rFonts w:ascii="Consolas" w:eastAsia="Times New Roman" w:hAnsi="Consolas" w:cs="Times New Roman"/>
+          <w:color w:val="9CDCFE"/>
+          <w:sz w:val="21"/>
+          <w:szCs w:val="21"/>
+          <w:lang w:bidi="he-IL"/>
+        </w:rPr>
+        <w:t>thread</w:t>
+      </w:r>
+      <w:r>
+        <w:rPr>
+          <w:rFonts w:ascii="Consolas" w:eastAsia="Times New Roman" w:hAnsi="Consolas" w:cs="Times New Roman"/>
+          <w:color w:val="CCCCCC"/>
+          <w:sz w:val="21"/>
+          <w:szCs w:val="21"/>
+          <w:lang w:bidi="he-IL"/>
+        </w:rPr>
+        <w:t>.</w:t>
+      </w:r>
+      <w:r>
+        <w:rPr>
+          <w:rFonts w:ascii="Consolas" w:eastAsia="Times New Roman" w:hAnsi="Consolas" w:cs="Times New Roman"/>
+          <w:color w:val="4EC9B0"/>
+          <w:sz w:val="21"/>
+          <w:szCs w:val="21"/>
+          <w:lang w:bidi="he-IL"/>
+        </w:rPr>
+        <w:t>SIG_JOIN_DATA_READY</w:t>
+      </w:r>
+    </w:p>
+    <w:p>
+      <w:pPr>
+        <w:pStyle w:val="ListParagraph"/>
+        <w:numPr>
+          <w:ilvl w:val="0"/>
+          <w:numId w:val="4"/>
+        </w:numPr>
+        <w:shd w:val="clear" w:color="auto" w:fill="1F1F1F"/>
+        <w:spacing w:after="0" w:line="285" w:lineRule="atLeast"/>
+        <w:rPr>
+          <w:rFonts w:ascii="Consolas" w:eastAsia="Times New Roman" w:hAnsi="Consolas" w:cs="Times New Roman"/>
+          <w:color w:val="CCCCCC"/>
+          <w:sz w:val="21"/>
+          <w:szCs w:val="21"/>
+          <w:lang w:bidi="he-IL"/>
+        </w:rPr>
+      </w:pPr>
+      <w:r>
+        <w:rPr>
+          <w:rFonts w:ascii="Consolas" w:eastAsia="Times New Roman" w:hAnsi="Consolas" w:cs="Times New Roman"/>
+          <w:color w:val="569CD6"/>
+          <w:sz w:val="21"/>
+          <w:szCs w:val="21"/>
+          <w:lang w:bidi="he-IL"/>
+        </w:rPr>
+        <w:t>local</w:t>
+      </w:r>
+      <w:r>
+        <w:rPr>
+          <w:rFonts w:ascii="Consolas" w:eastAsia="Times New Roman" w:hAnsi="Consolas" w:cs="Times New Roman"/>
+          <w:color w:val="CCCCCC"/>
+          <w:sz w:val="21"/>
+          <w:szCs w:val="21"/>
+          <w:lang w:bidi="he-IL"/>
+        </w:rPr>
+        <w:t xml:space="preserve"> </w:t>
+      </w:r>
+      <w:r>
+        <w:rPr>
+          <w:rFonts w:ascii="Consolas" w:eastAsia="Times New Roman" w:hAnsi="Consolas" w:cs="Times New Roman"/>
+          <w:color w:val="9CDCFE"/>
+          <w:sz w:val="21"/>
+          <w:szCs w:val="21"/>
+          <w:lang w:bidi="he-IL"/>
+        </w:rPr>
+        <w:t>SIG_TERMINATE</w:t>
+      </w:r>
+      <w:r>
+        <w:rPr>
+          <w:rFonts w:ascii="Consolas" w:eastAsia="Times New Roman" w:hAnsi="Consolas" w:cs="Times New Roman"/>
+          <w:color w:val="CCCCCC"/>
+          <w:sz w:val="21"/>
+          <w:szCs w:val="21"/>
+          <w:lang w:bidi="he-IL"/>
+        </w:rPr>
+        <w:t xml:space="preserve">         </w:t>
+      </w:r>
+      <w:r>
+        <w:rPr>
+          <w:rFonts w:ascii="Consolas" w:eastAsia="Times New Roman" w:hAnsi="Consolas" w:cs="Times New Roman"/>
+          <w:color w:val="D4D4D4"/>
+          <w:sz w:val="21"/>
+          <w:szCs w:val="21"/>
+          <w:lang w:bidi="he-IL"/>
+        </w:rPr>
+        <w:t>=</w:t>
+      </w:r>
+      <w:r>
+        <w:rPr>
+          <w:rFonts w:ascii="Consolas" w:eastAsia="Times New Roman" w:hAnsi="Consolas" w:cs="Times New Roman"/>
+          <w:color w:val="CCCCCC"/>
+          <w:sz w:val="21"/>
+          <w:szCs w:val="21"/>
+          <w:lang w:bidi="he-IL"/>
+        </w:rPr>
+        <w:t xml:space="preserve"> </w:t>
+      </w:r>
+      <w:r>
+        <w:rPr>
+          <w:rFonts w:ascii="Consolas" w:eastAsia="Times New Roman" w:hAnsi="Consolas" w:cs="Times New Roman"/>
+          <w:color w:val="9CDCFE"/>
+          <w:sz w:val="21"/>
+          <w:szCs w:val="21"/>
+          <w:lang w:bidi="he-IL"/>
+        </w:rPr>
+        <w:t>thread</w:t>
+      </w:r>
+      <w:r>
+        <w:rPr>
+          <w:rFonts w:ascii="Consolas" w:eastAsia="Times New Roman" w:hAnsi="Consolas" w:cs="Times New Roman"/>
+          <w:color w:val="CCCCCC"/>
+          <w:sz w:val="21"/>
+          <w:szCs w:val="21"/>
+          <w:lang w:bidi="he-IL"/>
+        </w:rPr>
+        <w:t>.</w:t>
+      </w:r>
+      <w:r>
+        <w:rPr>
+          <w:rFonts w:ascii="Consolas" w:eastAsia="Times New Roman" w:hAnsi="Consolas" w:cs="Times New Roman"/>
+          <w:color w:val="4EC9B0"/>
+          <w:sz w:val="21"/>
+          <w:szCs w:val="21"/>
+          <w:lang w:bidi="he-IL"/>
+        </w:rPr>
+        <w:t>SIG_TERMINATE</w:t>
+      </w:r>
+    </w:p>
+    <w:p>
+      <w:pPr>
+        <w:pStyle w:val="ListParagraph"/>
+        <w:numPr>
+          <w:ilvl w:val="0"/>
+          <w:numId w:val="4"/>
+        </w:numPr>
+        <w:shd w:val="clear" w:color="auto" w:fill="1F1F1F"/>
+        <w:spacing w:after="0" w:line="285" w:lineRule="atLeast"/>
+        <w:rPr>
+          <w:rFonts w:ascii="Consolas" w:eastAsia="Times New Roman" w:hAnsi="Consolas" w:cs="Times New Roman"/>
+          <w:color w:val="CCCCCC"/>
+          <w:sz w:val="21"/>
+          <w:szCs w:val="21"/>
+          <w:lang w:bidi="he-IL"/>
+        </w:rPr>
+      </w:pPr>
+      <w:r>
+        <w:rPr>
+          <w:rFonts w:ascii="Consolas" w:eastAsia="Times New Roman" w:hAnsi="Consolas" w:cs="Times New Roman"/>
+          <w:color w:val="569CD6"/>
+          <w:sz w:val="21"/>
+          <w:szCs w:val="21"/>
+          <w:lang w:bidi="he-IL"/>
+        </w:rPr>
+        <w:t>local</w:t>
+      </w:r>
+      <w:r>
+        <w:rPr>
+          <w:rFonts w:ascii="Consolas" w:eastAsia="Times New Roman" w:hAnsi="Consolas" w:cs="Times New Roman"/>
+          <w:color w:val="CCCCCC"/>
+          <w:sz w:val="21"/>
+          <w:szCs w:val="21"/>
+          <w:lang w:bidi="he-IL"/>
+        </w:rPr>
+        <w:t xml:space="preserve"> </w:t>
+      </w:r>
+      <w:r>
+        <w:rPr>
+          <w:rFonts w:ascii="Consolas" w:eastAsia="Times New Roman" w:hAnsi="Consolas" w:cs="Times New Roman"/>
+          <w:color w:val="9CDCFE"/>
+          <w:sz w:val="21"/>
+          <w:szCs w:val="21"/>
+          <w:lang w:bidi="he-IL"/>
+        </w:rPr>
+        <w:t>SIG_METRICS</w:t>
+      </w:r>
+      <w:r>
+        <w:rPr>
+          <w:rFonts w:ascii="Consolas" w:eastAsia="Times New Roman" w:hAnsi="Consolas" w:cs="Times New Roman"/>
+          <w:color w:val="CCCCCC"/>
+          <w:sz w:val="21"/>
+          <w:szCs w:val="21"/>
+          <w:lang w:bidi="he-IL"/>
+        </w:rPr>
+        <w:t xml:space="preserve">           </w:t>
+      </w:r>
+      <w:r>
+        <w:rPr>
+          <w:rFonts w:ascii="Consolas" w:eastAsia="Times New Roman" w:hAnsi="Consolas" w:cs="Times New Roman"/>
+          <w:color w:val="D4D4D4"/>
+          <w:sz w:val="21"/>
+          <w:szCs w:val="21"/>
+          <w:lang w:bidi="he-IL"/>
+        </w:rPr>
+        <w:t>=</w:t>
+      </w:r>
+      <w:r>
+        <w:rPr>
+          <w:rFonts w:ascii="Consolas" w:eastAsia="Times New Roman" w:hAnsi="Consolas" w:cs="Times New Roman"/>
+          <w:color w:val="CCCCCC"/>
+          <w:sz w:val="21"/>
+          <w:szCs w:val="21"/>
+          <w:lang w:bidi="he-IL"/>
+        </w:rPr>
+        <w:t xml:space="preserve"> </w:t>
+      </w:r>
+      <w:r>
+        <w:rPr>
+          <w:rFonts w:ascii="Consolas" w:eastAsia="Times New Roman" w:hAnsi="Consolas" w:cs="Times New Roman"/>
+          <w:color w:val="9CDCFE"/>
+          <w:sz w:val="21"/>
+          <w:szCs w:val="21"/>
+          <w:lang w:bidi="he-IL"/>
+        </w:rPr>
+        <w:t>thread</w:t>
+      </w:r>
+      <w:r>
+        <w:rPr>
+          <w:rFonts w:ascii="Consolas" w:eastAsia="Times New Roman" w:hAnsi="Consolas" w:cs="Times New Roman"/>
+          <w:color w:val="CCCCCC"/>
+          <w:sz w:val="21"/>
+          <w:szCs w:val="21"/>
+          <w:lang w:bidi="he-IL"/>
+        </w:rPr>
+        <w:t>.</w:t>
+      </w:r>
+      <w:r>
+        <w:rPr>
+          <w:rFonts w:ascii="Consolas" w:eastAsia="Times New Roman" w:hAnsi="Consolas" w:cs="Times New Roman"/>
+          <w:color w:val="4EC9B0"/>
+          <w:sz w:val="21"/>
+          <w:szCs w:val="21"/>
+          <w:lang w:bidi="he-IL"/>
+        </w:rPr>
+        <w:t>SIG_METRICS</w:t>
+      </w:r>
+    </w:p>
+    <w:p>
+      <w:pPr>
+        <w:pStyle w:val="ListParagraph"/>
+        <w:numPr>
+          <w:ilvl w:val="0"/>
+          <w:numId w:val="4"/>
+        </w:numPr>
+        <w:shd w:val="clear" w:color="auto" w:fill="1F1F1F"/>
+        <w:spacing w:after="0" w:line="285" w:lineRule="atLeast"/>
+        <w:rPr>
+          <w:rFonts w:ascii="Consolas" w:eastAsia="Times New Roman" w:hAnsi="Consolas" w:cs="Times New Roman"/>
+          <w:color w:val="CCCCCC"/>
+          <w:sz w:val="21"/>
+          <w:szCs w:val="21"/>
+          <w:lang w:bidi="he-IL"/>
+        </w:rPr>
+      </w:pPr>
+      <w:r>
+        <w:rPr>
+          <w:rFonts w:ascii="Consolas" w:eastAsia="Times New Roman" w:hAnsi="Consolas" w:cs="Times New Roman"/>
+          <w:color w:val="569CD6"/>
+          <w:sz w:val="21"/>
+          <w:szCs w:val="21"/>
+          <w:lang w:bidi="he-IL"/>
+        </w:rPr>
+        <w:t>local</w:t>
+      </w:r>
+      <w:r>
+        <w:rPr>
+          <w:rFonts w:ascii="Consolas" w:eastAsia="Times New Roman" w:hAnsi="Consolas" w:cs="Times New Roman"/>
+          <w:color w:val="CCCCCC"/>
+          <w:sz w:val="21"/>
+          <w:szCs w:val="21"/>
+          <w:lang w:bidi="he-IL"/>
+        </w:rPr>
+        <w:t xml:space="preserve"> </w:t>
+      </w:r>
+      <w:r>
+        <w:rPr>
+          <w:rFonts w:ascii="Consolas" w:eastAsia="Times New Roman" w:hAnsi="Consolas" w:cs="Times New Roman"/>
+          <w:color w:val="9CDCFE"/>
+          <w:sz w:val="21"/>
+          <w:szCs w:val="21"/>
+          <w:lang w:bidi="he-IL"/>
+        </w:rPr>
+        <w:t>SIG_NONE_PENDING</w:t>
+      </w:r>
+      <w:r>
+        <w:rPr>
+          <w:rFonts w:ascii="Consolas" w:eastAsia="Times New Roman" w:hAnsi="Consolas" w:cs="Times New Roman"/>
+          <w:color w:val="CCCCCC"/>
+          <w:sz w:val="21"/>
+          <w:szCs w:val="21"/>
+          <w:lang w:bidi="he-IL"/>
+        </w:rPr>
+        <w:t xml:space="preserve">      </w:t>
+      </w:r>
+      <w:r>
+        <w:rPr>
+          <w:rFonts w:ascii="Consolas" w:eastAsia="Times New Roman" w:hAnsi="Consolas" w:cs="Times New Roman"/>
+          <w:color w:val="D4D4D4"/>
+          <w:sz w:val="21"/>
+          <w:szCs w:val="21"/>
+          <w:lang w:bidi="he-IL"/>
+        </w:rPr>
+        <w:t>=</w:t>
+      </w:r>
+      <w:r>
+        <w:rPr>
+          <w:rFonts w:ascii="Consolas" w:eastAsia="Times New Roman" w:hAnsi="Consolas" w:cs="Times New Roman"/>
+          <w:color w:val="CCCCCC"/>
+          <w:sz w:val="21"/>
+          <w:szCs w:val="21"/>
+          <w:lang w:bidi="he-IL"/>
+        </w:rPr>
+        <w:t xml:space="preserve"> </w:t>
+      </w:r>
+      <w:r>
+        <w:rPr>
+          <w:rFonts w:ascii="Consolas" w:eastAsia="Times New Roman" w:hAnsi="Consolas" w:cs="Times New Roman"/>
+          <w:color w:val="9CDCFE"/>
+          <w:sz w:val="21"/>
+          <w:szCs w:val="21"/>
+          <w:lang w:bidi="he-IL"/>
+        </w:rPr>
+        <w:t>thread</w:t>
+      </w:r>
+      <w:r>
+        <w:rPr>
+          <w:rFonts w:ascii="Consolas" w:eastAsia="Times New Roman" w:hAnsi="Consolas" w:cs="Times New Roman"/>
+          <w:color w:val="CCCCCC"/>
+          <w:sz w:val="21"/>
+          <w:szCs w:val="21"/>
+          <w:lang w:bidi="he-IL"/>
+        </w:rPr>
+        <w:t>.</w:t>
+      </w:r>
+      <w:r>
+        <w:rPr>
+          <w:rFonts w:ascii="Consolas" w:eastAsia="Times New Roman" w:hAnsi="Consolas" w:cs="Times New Roman"/>
+          <w:color w:val="4EC9B0"/>
+          <w:sz w:val="21"/>
+          <w:szCs w:val="21"/>
+          <w:lang w:bidi="he-IL"/>
+        </w:rPr>
+        <w:t>SIG_NONE_PENDING</w:t>
+      </w:r>
+    </w:p>
+    <w:p>
+      <w:pPr>
+        <w:pStyle w:val="ListParagraph"/>
+        <w:numPr>
+          <w:ilvl w:val="0"/>
+          <w:numId w:val="4"/>
+        </w:numPr>
+        <w:shd w:val="clear" w:color="auto" w:fill="1F1F1F"/>
+        <w:spacing w:after="0" w:line="285" w:lineRule="atLeast"/>
+        <w:rPr>
+          <w:rFonts w:ascii="Consolas" w:eastAsia="Times New Roman" w:hAnsi="Consolas" w:cs="Times New Roman"/>
+          <w:color w:val="CCCCCC"/>
+          <w:sz w:val="21"/>
+          <w:szCs w:val="21"/>
+          <w:lang w:bidi="he-IL"/>
+        </w:rPr>
+      </w:pPr>
+    </w:p>
+    <w:p>
+      <w:pPr>
+        <w:pStyle w:val="ListParagraph"/>
+      </w:pPr>
+    </w:p>
+    <w:p>
+      <w:pPr>
+        <w:pStyle w:val="ListParagraph"/>
+        <w:spacing w:after="240" w:line="240" w:lineRule="auto"/>
+        <w:ind w:left="360"/>
+      </w:pPr>
+      <w:r>
+        <w:t>3. Edit your addons .toc file accordingly. Here, for example, is the .toc file from one of the testing addons.</w:t>
+      </w:r>
+    </w:p>
+    <w:p>
+      <w:pPr>
+        <w:pStyle w:val="ListParagraph"/>
+        <w:ind w:left="360"/>
+      </w:pPr>
+    </w:p>
+    <w:p>
+      <w:pPr>
+        <w:pStyle w:val="ListParagraph"/>
+        <w:ind w:left="360"/>
+      </w:pPr>
+      <w:r>
+        <w:tab/>
+      </w:r>
+      <w:r>
+        <w:t>## Interface: 100100</w:t>
+      </w:r>
+    </w:p>
+    <w:p>
+      <w:pPr>
+        <w:pStyle w:val="ListParagraph"/>
+        <w:ind w:left="360"/>
+      </w:pPr>
+      <w:r>
+        <w:tab/>
+      </w:r>
+      <w:r>
+        <w:t>###----------------------------------------------</w:t>
+      </w:r>
+    </w:p>
+    <w:p>
+      <w:pPr>
+        <w:pStyle w:val="ListParagraph"/>
+        <w:ind w:left="360"/>
+      </w:pPr>
+      <w:r>
+        <w:tab/>
+      </w:r>
+      <w:r>
+        <w:t>## Title: TestAddonTwo</w:t>
+      </w:r>
+    </w:p>
+    <w:p>
+      <w:pPr>
+        <w:pStyle w:val="ListParagraph"/>
+        <w:ind w:left="360"/>
+      </w:pPr>
+      <w:r>
+        <w:tab/>
+      </w:r>
+      <w:r>
+        <w:t>## Notes: A Testing Addon for WoWThreads</w:t>
+      </w:r>
+    </w:p>
+    <w:p>
+      <w:pPr>
+        <w:pStyle w:val="ListParagraph"/>
+        <w:ind w:left="360"/>
+      </w:pPr>
+      <w:r>
+        <w:tab/>
+      </w:r>
+      <w:r>
+        <w:t xml:space="preserve">## Author: </w:t>
+      </w:r>
+    </w:p>
+    <w:p>
+      <w:pPr>
+        <w:pStyle w:val="ListParagraph"/>
+        <w:ind w:left="360"/>
+      </w:pPr>
+      <w:r>
+        <w:tab/>
+      </w:r>
+      <w:r>
+        <w:t>## SavedVariablesPerCharacter:</w:t>
+      </w:r>
+    </w:p>
+    <w:p>
+      <w:pPr>
+        <w:pStyle w:val="ListParagraph"/>
+        <w:ind w:left="360"/>
+      </w:pPr>
+      <w:r>
+        <w:tab/>
+      </w:r>
+      <w:r>
+        <w:t xml:space="preserve">## SavedVariables: </w:t>
+      </w:r>
+    </w:p>
+    <w:p>
+      <w:pPr>
+        <w:pStyle w:val="ListParagraph"/>
+        <w:ind w:left="360"/>
+      </w:pPr>
+      <w:r>
+        <w:tab/>
+      </w:r>
+      <w:r>
+        <w:t xml:space="preserve">## Version: 1.0.0 </w:t>
+      </w:r>
+    </w:p>
+    <w:p>
+      <w:pPr>
+        <w:pStyle w:val="ListParagraph"/>
+        <w:ind w:left="360"/>
+      </w:pPr>
+      <w:r>
+        <w:tab/>
+      </w:r>
+      <w:r>
+        <w:t>## X-Expansion: WotLK, Retail</w:t>
+      </w:r>
+    </w:p>
+    <w:p>
+      <w:pPr>
+        <w:pStyle w:val="ListParagraph"/>
+        <w:ind w:left="360"/>
+      </w:pPr>
+      <w:r>
+        <w:tab/>
+      </w:r>
+      <w:r>
+        <w:t>## 24 May 2023</w:t>
+      </w:r>
+    </w:p>
+    <w:p>
+      <w:pPr>
+        <w:pStyle w:val="ListParagraph"/>
+        <w:ind w:left="360"/>
+      </w:pPr>
+      <w:r>
+        <w:tab/>
+      </w:r>
+      <w:r>
+        <w:t>## Dependencies: WoWThreads</w:t>
+      </w:r>
+    </w:p>
+    <w:p>
+      <w:pPr>
+        <w:pStyle w:val="ListParagraph"/>
+        <w:ind w:left="360"/>
+      </w:pPr>
+      <w:r>
+        <w:tab/>
+      </w:r>
+      <w:r>
+        <w:t>## IconTexture: 3717417</w:t>
+      </w:r>
+    </w:p>
+    <w:p>
+      <w:pPr>
+        <w:pStyle w:val="ListParagraph"/>
+        <w:ind w:left="360"/>
+      </w:pPr>
+      <w:r>
+        <w:tab/>
+      </w:r>
+      <w:r>
+        <w:t>## X-Expansions: WotLK, Retail</w:t>
+      </w:r>
+    </w:p>
+    <w:p>
+      <w:pPr>
+        <w:pStyle w:val="ListParagraph"/>
+        <w:ind w:left="360"/>
+      </w:pPr>
+      <w:r>
+        <w:tab/>
+        <w:t>##--------------------------------------------------</w:t>
+      </w:r>
+    </w:p>
+    <w:p>
+      <w:pPr>
+        <w:pStyle w:val="ListParagraph"/>
+        <w:ind w:left="360"/>
+      </w:pPr>
+      <w:r>
+        <w:tab/>
+        <w:t xml:space="preserve">## These tests are run at every </w:t>
+      </w:r>
+      <w:r>
+        <w:t xml:space="preserve">UI </w:t>
+      </w:r>
+      <w:r>
+        <w:t>reboot, or login.</w:t>
+      </w:r>
+    </w:p>
+    <w:p>
+      <w:pPr>
+        <w:pStyle w:val="ListParagraph"/>
+        <w:ind w:left="360"/>
+      </w:pPr>
+      <w:r>
+        <w:tab/>
+      </w:r>
+    </w:p>
+    <w:p>
+      <w:pPr>
+        <w:pStyle w:val="ListParagraph"/>
+        <w:ind w:left="360"/>
+      </w:pPr>
+      <w:r>
+        <w:tab/>
+      </w:r>
+      <w:r>
+        <w:t>ThreadTest1.lua</w:t>
+      </w:r>
+    </w:p>
+    <w:p>
+      <w:pPr>
+        <w:pStyle w:val="ListParagraph"/>
+        <w:ind w:left="360"/>
+      </w:pPr>
+      <w:r>
+        <w:tab/>
+      </w:r>
+      <w:r>
+        <w:t>ThreadTest2.lua</w:t>
+      </w:r>
+    </w:p>
+    <w:p>
+      <w:pPr>
+        <w:pStyle w:val="ListParagraph"/>
+        <w:ind w:left="360"/>
+      </w:pPr>
+      <w:r>
+        <w:tab/>
+      </w:r>
+      <w:r>
+        <w:t>ThreadTest3.lua</w:t>
+      </w:r>
+    </w:p>
+    <w:p>
+      <w:pPr>
+        <w:pStyle w:val="ListParagraph"/>
+        <w:ind w:left="360"/>
+        <w:sectPr>
+          <w:pgSz w:w="12240" w:h="15840"/>
+          <w:pgMar w:top="1440" w:right="1440" w:bottom="1440" w:left="1440" w:header="720" w:footer="720" w:gutter="0"/>
+          <w:cols w:space="720"/>
+          <w:docGrid w:linePitch="360"/>
+        </w:sectPr>
+      </w:pPr>
+    </w:p>
+    <w:p>
+      <w:pPr>
+        <w:pStyle w:val="Heading1"/>
+      </w:pPr>
+      <w:r>
+        <w:lastRenderedPageBreak/>
         <w:t>WoWThreads library</w:t>
       </w:r>
       <w:r>
@@ -46,13 +1948,7 @@
         <w:pStyle w:val="Code"/>
       </w:pPr>
       <w:r>
-        <w:t xml:space="preserve">local </w:t>
-      </w:r>
-      <w:r>
-        <w:t>thread</w:t>
-      </w:r>
-      <w:r>
-        <w:t xml:space="preserve"> = LibStub:GetLibrary( Major )</w:t>
+        <w:t>local thread = LibStub:GetLibrary( Major )</w:t>
       </w:r>
     </w:p>
     <w:p>
@@ -96,15 +1992,7 @@
       </w:r>
       <w:r>
         <w:tab/>
-      </w:r>
-      <w:r>
-        <w:t xml:space="preserve"> = </w:t>
-      </w:r>
-      <w:r>
-        <w:t>thread.</w:t>
-      </w:r>
-      <w:r>
-        <w:t>SIG_ALERT</w:t>
+        <w:t xml:space="preserve"> = thread.SIG_ALERT</w:t>
       </w:r>
     </w:p>
     <w:p>
@@ -116,15 +2004,7 @@
       </w:r>
       <w:r>
         <w:tab/>
-      </w:r>
-      <w:r>
-        <w:t xml:space="preserve">= </w:t>
-      </w:r>
-      <w:r>
-        <w:t>thread.</w:t>
-      </w:r>
-      <w:r>
-        <w:t>SIG_JOIN_DATA_READY</w:t>
+        <w:t>= thread.SIG_JOIN_DATA_READY</w:t>
       </w:r>
     </w:p>
     <w:p>
@@ -136,15 +2016,7 @@
       </w:r>
       <w:r>
         <w:tab/>
-      </w:r>
-      <w:r>
-        <w:t xml:space="preserve">= </w:t>
-      </w:r>
-      <w:r>
-        <w:t>thread.</w:t>
-      </w:r>
-      <w:r>
-        <w:t>SIG_TERMINATE</w:t>
+        <w:t>= thread.SIG_TERMINATE</w:t>
       </w:r>
     </w:p>
     <w:p>
@@ -159,15 +2031,7 @@
       </w:r>
       <w:r>
         <w:tab/>
-      </w:r>
-      <w:r>
-        <w:t xml:space="preserve"> = </w:t>
-      </w:r>
-      <w:r>
-        <w:t>thread.</w:t>
-      </w:r>
-      <w:r>
-        <w:t>SIG_METRICS</w:t>
+        <w:t xml:space="preserve"> = thread.SIG_METRICS</w:t>
       </w:r>
     </w:p>
     <w:p>
@@ -179,15 +2043,7 @@
       </w:r>
       <w:r>
         <w:tab/>
-      </w:r>
-      <w:r>
-        <w:t xml:space="preserve">= </w:t>
-      </w:r>
-      <w:r>
-        <w:t>thread.</w:t>
-      </w:r>
-      <w:r>
-        <w:t>SIG_NONE_PENDING</w:t>
+        <w:t>= thread.SIG_NONE_PENDING</w:t>
       </w:r>
     </w:p>
     <w:p>
@@ -1392,6 +3248,7 @@
               <w:spacing w:before="120"/>
             </w:pPr>
             <w:r>
+              <w:lastRenderedPageBreak/>
               <w:t>local threadId</w:t>
             </w:r>
             <w:r>
@@ -2189,7 +4046,13 @@
       </w:pPr>
       <w:r>
         <w:lastRenderedPageBreak/>
-        <w:t>thread:getCongestion( thread_h )</w:t>
+        <w:t>thread:getCongestion</w:t>
+      </w:r>
+      <w:r>
+        <w:t>Entry</w:t>
+      </w:r>
+      <w:r>
+        <w:t>( thread_h )</w:t>
       </w:r>
     </w:p>
     <w:tbl>
@@ -2304,7 +4167,13 @@
               <w:t xml:space="preserve">entry = </w:t>
             </w:r>
             <w:r>
-              <w:t>{ threadId, ticksPerYield, totalTimeSuspended, numResumptions, lifeTime }</w:t>
+              <w:t xml:space="preserve">{ threadId, </w:t>
+            </w:r>
+            <w:r>
+              <w:t>threadCongestion</w:t>
+            </w:r>
+            <w:r>
+              <w:t>}</w:t>
             </w:r>
           </w:p>
         </w:tc>
@@ -2331,20 +4200,22 @@
             <w:pPr>
               <w:pStyle w:val="Code"/>
             </w:pPr>
-          </w:p>
+            <w:r>
+              <w:t>local entry, result = thread:getCongestionEntry( thread_h )</w:t>
+            </w:r>
+          </w:p>
+          <w:p>
+            <w:pPr>
+              <w:pStyle w:val="Code"/>
+            </w:pPr>
+            <w:r>
+              <w:t>if not result[1] then thread:postResult( result ) end</w:t>
+            </w:r>
+          </w:p>
+          <w:p/>
         </w:tc>
       </w:tr>
     </w:tbl>
-    <w:p/>
-    <w:p/>
-    <w:p>
-      <w:r>
-        <w:t xml:space="preserve">entry = </w:t>
-      </w:r>
-      <w:r>
-        <w:t>{ threadId, ticksPerYield, totalTimeSuspended, numResumptions, lifeTime }</w:t>
-      </w:r>
-    </w:p>
     <w:p>
       <w:pPr>
         <w:pStyle w:val="Heading1"/>
@@ -2530,7 +4401,13 @@
         <w:pStyle w:val="Heading2"/>
       </w:pPr>
       <w:r>
-        <w:t>thread:postInfo( msg  )</w:t>
+        <w:t>thread:post</w:t>
+      </w:r>
+      <w:r>
+        <w:t>Msg</w:t>
+      </w:r>
+      <w:r>
+        <w:t>( msg  )</w:t>
       </w:r>
     </w:p>
     <w:tbl>
@@ -2585,19 +4462,7 @@
         <w:pStyle w:val="Heading2"/>
       </w:pPr>
       <w:r>
-        <w:t>thread:post</w:t>
-      </w:r>
-      <w:r>
-        <w:t>Result</w:t>
-      </w:r>
-      <w:r>
-        <w:t xml:space="preserve">( </w:t>
-      </w:r>
-      <w:r>
-        <w:t>result</w:t>
-      </w:r>
-      <w:r>
-        <w:t xml:space="preserve"> )</w:t>
+        <w:t>thread:postResult( result )</w:t>
       </w:r>
     </w:p>
     <w:tbl>
@@ -2822,12 +4687,262 @@
       </w:r>
     </w:p>
   </w:footnote>
+  <w:footnote w:id="1">
+    <w:p>
+      <w:pPr>
+        <w:pStyle w:val="FootnoteText"/>
+      </w:pPr>
+      <w:r>
+        <w:rPr>
+          <w:rStyle w:val="FootnoteReference"/>
+        </w:rPr>
+        <w:footnoteRef/>
+      </w:r>
+      <w:r>
+        <w:t xml:space="preserve"> The ideal suspension time is just the specified yield time (from thread:create()) times the number of times the thread returns from thread:yield().</w:t>
+      </w:r>
+    </w:p>
+  </w:footnote>
+  <w:footnote w:id="2">
+    <w:p>
+      <w:pPr>
+        <w:pStyle w:val="FootnoteText"/>
+      </w:pPr>
+      <w:r>
+        <w:rPr>
+          <w:rStyle w:val="FootnoteReference"/>
+        </w:rPr>
+        <w:footnoteRef/>
+      </w:r>
+      <w:r>
+        <w:t xml:space="preserve"> Each of 100 threads repeatedly counts to a number between 20,000 and 80,000 five times yielding for 32 ms between each iteration.</w:t>
+      </w:r>
+    </w:p>
+  </w:footnote>
+  <w:footnote w:id="3">
+    <w:p>
+      <w:pPr>
+        <w:pStyle w:val="FootnoteText"/>
+      </w:pPr>
+      <w:r>
+        <w:rPr>
+          <w:rStyle w:val="FootnoteReference"/>
+        </w:rPr>
+        <w:footnoteRef/>
+      </w:r>
+      <w:r>
+        <w:t xml:space="preserve"> Not published</w:t>
+      </w:r>
+    </w:p>
+  </w:footnote>
 </w:footnotes>
 </file>
 
 <file path=word/numbering.xml><?xml version="1.0" encoding="utf-8"?>
 <w:numbering xmlns:wpc="http://schemas.microsoft.com/office/word/2010/wordprocessingCanvas" xmlns:cx="http://schemas.microsoft.com/office/drawing/2014/chartex" xmlns:cx1="http://schemas.microsoft.com/office/drawing/2015/9/8/chartex" xmlns:cx2="http://schemas.microsoft.com/office/drawing/2015/10/21/chartex" xmlns:cx3="http://schemas.microsoft.com/office/drawing/2016/5/9/chartex" xmlns:cx4="http://schemas.microsoft.com/office/drawing/2016/5/10/chartex" xmlns:cx5="http://schemas.microsoft.com/office/drawing/2016/5/11/chartex" xmlns:cx6="http://schemas.microsoft.com/office/drawing/2016/5/12/chartex" xmlns:cx7="http://schemas.microsoft.com/office/drawing/2016/5/13/chartex" xmlns:cx8="http://schemas.microsoft.com/office/drawing/2016/5/14/chartex" xmlns:mc="http://schemas.openxmlformats.org/markup-compatibility/2006" xmlns:aink="http://schemas.microsoft.com/office/drawing/2016/ink" xmlns:am3d="http://schemas.microsoft.com/office/drawing/2017/model3d" xmlns:o="urn:schemas-microsoft-com:office:office" xmlns:oel="http://schemas.microsoft.com/office/2019/extlst" xmlns:r="http://schemas.openxmlformats.org/officeDocument/2006/relationships" xmlns:m="http://schemas.openxmlformats.org/officeDocument/2006/math" xmlns:v="urn:schemas-microsoft-com:vml" xmlns:wp14="http://schemas.microsoft.com/office/word/2010/wordprocessingDrawing" xmlns:wp="http://schemas.openxmlformats.org/drawingml/2006/wordprocessingDrawing" xmlns:w10="urn:schemas-microsoft-com:office:word" xmlns:w="http://schemas.openxmlformats.org/wordprocessingml/2006/main" xmlns:w14="http://schemas.microsoft.com/office/word/2010/wordml" xmlns:w15="http://schemas.microsoft.com/office/word/2012/wordml" xmlns:w16cex="http://schemas.microsoft.com/office/word/2018/wordml/cex" xmlns:w16cid="http://schemas.microsoft.com/office/word/2016/wordml/cid" xmlns:w16="http://schemas.microsoft.com/office/word/2018/wordml" xmlns:w16sdtdh="http://schemas.microsoft.com/office/word/2020/wordml/sdtdatahash" xmlns:w16se="http://schemas.microsoft.com/office/word/2015/wordml/symex" xmlns:wpg="http://schemas.microsoft.com/office/word/2010/wordprocessingGroup" xmlns:wpi="http://schemas.microsoft.com/office/word/2010/wordprocessingInk" xmlns:wne="http://schemas.microsoft.com/office/word/2006/wordml" xmlns:wps="http://schemas.microsoft.com/office/word/2010/wordprocessingShape" mc:Ignorable="w14 w15 w16se w16cid w16 w16cex w16sdtdh wp14">
   <w:abstractNum w:abstractNumId="0" w15:restartNumberingAfterBreak="0">
+    <w:nsid w:val="3E0463A7"/>
+    <w:multiLevelType w:val="hybridMultilevel"/>
+    <w:tmpl w:val="9F9EF32E"/>
+    <w:lvl w:ilvl="0" w:tplc="04090001">
+      <w:start w:val="1"/>
+      <w:numFmt w:val="bullet"/>
+      <w:lvlText w:val=""/>
+      <w:lvlJc w:val="left"/>
+      <w:pPr>
+        <w:ind w:left="720" w:hanging="360"/>
+      </w:pPr>
+      <w:rPr>
+        <w:rFonts w:ascii="Symbol" w:hAnsi="Symbol" w:hint="default"/>
+      </w:rPr>
+    </w:lvl>
+    <w:lvl w:ilvl="1" w:tplc="04090003" w:tentative="1">
+      <w:start w:val="1"/>
+      <w:numFmt w:val="bullet"/>
+      <w:lvlText w:val="o"/>
+      <w:lvlJc w:val="left"/>
+      <w:pPr>
+        <w:ind w:left="1440" w:hanging="360"/>
+      </w:pPr>
+      <w:rPr>
+        <w:rFonts w:ascii="Courier New" w:hAnsi="Courier New" w:cs="Courier New" w:hint="default"/>
+      </w:rPr>
+    </w:lvl>
+    <w:lvl w:ilvl="2" w:tplc="04090005" w:tentative="1">
+      <w:start w:val="1"/>
+      <w:numFmt w:val="bullet"/>
+      <w:lvlText w:val=""/>
+      <w:lvlJc w:val="left"/>
+      <w:pPr>
+        <w:ind w:left="2160" w:hanging="360"/>
+      </w:pPr>
+      <w:rPr>
+        <w:rFonts w:ascii="Wingdings" w:hAnsi="Wingdings" w:hint="default"/>
+      </w:rPr>
+    </w:lvl>
+    <w:lvl w:ilvl="3" w:tplc="04090001" w:tentative="1">
+      <w:start w:val="1"/>
+      <w:numFmt w:val="bullet"/>
+      <w:lvlText w:val=""/>
+      <w:lvlJc w:val="left"/>
+      <w:pPr>
+        <w:ind w:left="2880" w:hanging="360"/>
+      </w:pPr>
+      <w:rPr>
+        <w:rFonts w:ascii="Symbol" w:hAnsi="Symbol" w:hint="default"/>
+      </w:rPr>
+    </w:lvl>
+    <w:lvl w:ilvl="4" w:tplc="04090003" w:tentative="1">
+      <w:start w:val="1"/>
+      <w:numFmt w:val="bullet"/>
+      <w:lvlText w:val="o"/>
+      <w:lvlJc w:val="left"/>
+      <w:pPr>
+        <w:ind w:left="3600" w:hanging="360"/>
+      </w:pPr>
+      <w:rPr>
+        <w:rFonts w:ascii="Courier New" w:hAnsi="Courier New" w:cs="Courier New" w:hint="default"/>
+      </w:rPr>
+    </w:lvl>
+    <w:lvl w:ilvl="5" w:tplc="04090005" w:tentative="1">
+      <w:start w:val="1"/>
+      <w:numFmt w:val="bullet"/>
+      <w:lvlText w:val=""/>
+      <w:lvlJc w:val="left"/>
+      <w:pPr>
+        <w:ind w:left="4320" w:hanging="360"/>
+      </w:pPr>
+      <w:rPr>
+        <w:rFonts w:ascii="Wingdings" w:hAnsi="Wingdings" w:hint="default"/>
+      </w:rPr>
+    </w:lvl>
+    <w:lvl w:ilvl="6" w:tplc="04090001" w:tentative="1">
+      <w:start w:val="1"/>
+      <w:numFmt w:val="bullet"/>
+      <w:lvlText w:val=""/>
+      <w:lvlJc w:val="left"/>
+      <w:pPr>
+        <w:ind w:left="5040" w:hanging="360"/>
+      </w:pPr>
+      <w:rPr>
+        <w:rFonts w:ascii="Symbol" w:hAnsi="Symbol" w:hint="default"/>
+      </w:rPr>
+    </w:lvl>
+    <w:lvl w:ilvl="7" w:tplc="04090003" w:tentative="1">
+      <w:start w:val="1"/>
+      <w:numFmt w:val="bullet"/>
+      <w:lvlText w:val="o"/>
+      <w:lvlJc w:val="left"/>
+      <w:pPr>
+        <w:ind w:left="5760" w:hanging="360"/>
+      </w:pPr>
+      <w:rPr>
+        <w:rFonts w:ascii="Courier New" w:hAnsi="Courier New" w:cs="Courier New" w:hint="default"/>
+      </w:rPr>
+    </w:lvl>
+    <w:lvl w:ilvl="8" w:tplc="04090005" w:tentative="1">
+      <w:start w:val="1"/>
+      <w:numFmt w:val="bullet"/>
+      <w:lvlText w:val=""/>
+      <w:lvlJc w:val="left"/>
+      <w:pPr>
+        <w:ind w:left="6480" w:hanging="360"/>
+      </w:pPr>
+      <w:rPr>
+        <w:rFonts w:ascii="Wingdings" w:hAnsi="Wingdings" w:hint="default"/>
+      </w:rPr>
+    </w:lvl>
+  </w:abstractNum>
+  <w:abstractNum w:abstractNumId="1" w15:restartNumberingAfterBreak="0">
+    <w:nsid w:val="3EED5262"/>
+    <w:multiLevelType w:val="hybridMultilevel"/>
+    <w:tmpl w:val="B0E4ADF4"/>
+    <w:lvl w:ilvl="0" w:tplc="0409000F">
+      <w:start w:val="1"/>
+      <w:numFmt w:val="decimal"/>
+      <w:lvlText w:val="%1."/>
+      <w:lvlJc w:val="left"/>
+      <w:pPr>
+        <w:ind w:left="720" w:hanging="360"/>
+      </w:pPr>
+      <w:rPr>
+        <w:rFonts w:hint="default"/>
+      </w:rPr>
+    </w:lvl>
+    <w:lvl w:ilvl="1" w:tplc="04090019" w:tentative="1">
+      <w:start w:val="1"/>
+      <w:numFmt w:val="lowerLetter"/>
+      <w:lvlText w:val="%2."/>
+      <w:lvlJc w:val="left"/>
+      <w:pPr>
+        <w:ind w:left="1440" w:hanging="360"/>
+      </w:pPr>
+    </w:lvl>
+    <w:lvl w:ilvl="2" w:tplc="0409001B" w:tentative="1">
+      <w:start w:val="1"/>
+      <w:numFmt w:val="lowerRoman"/>
+      <w:lvlText w:val="%3."/>
+      <w:lvlJc w:val="right"/>
+      <w:pPr>
+        <w:ind w:left="2160" w:hanging="180"/>
+      </w:pPr>
+    </w:lvl>
+    <w:lvl w:ilvl="3" w:tplc="0409000F" w:tentative="1">
+      <w:start w:val="1"/>
+      <w:numFmt w:val="decimal"/>
+      <w:lvlText w:val="%4."/>
+      <w:lvlJc w:val="left"/>
+      <w:pPr>
+        <w:ind w:left="2880" w:hanging="360"/>
+      </w:pPr>
+    </w:lvl>
+    <w:lvl w:ilvl="4" w:tplc="04090019" w:tentative="1">
+      <w:start w:val="1"/>
+      <w:numFmt w:val="lowerLetter"/>
+      <w:lvlText w:val="%5."/>
+      <w:lvlJc w:val="left"/>
+      <w:pPr>
+        <w:ind w:left="3600" w:hanging="360"/>
+      </w:pPr>
+    </w:lvl>
+    <w:lvl w:ilvl="5" w:tplc="0409001B" w:tentative="1">
+      <w:start w:val="1"/>
+      <w:numFmt w:val="lowerRoman"/>
+      <w:lvlText w:val="%6."/>
+      <w:lvlJc w:val="right"/>
+      <w:pPr>
+        <w:ind w:left="4320" w:hanging="180"/>
+      </w:pPr>
+    </w:lvl>
+    <w:lvl w:ilvl="6" w:tplc="0409000F" w:tentative="1">
+      <w:start w:val="1"/>
+      <w:numFmt w:val="decimal"/>
+      <w:lvlText w:val="%7."/>
+      <w:lvlJc w:val="left"/>
+      <w:pPr>
+        <w:ind w:left="5040" w:hanging="360"/>
+      </w:pPr>
+    </w:lvl>
+    <w:lvl w:ilvl="7" w:tplc="04090019" w:tentative="1">
+      <w:start w:val="1"/>
+      <w:numFmt w:val="lowerLetter"/>
+      <w:lvlText w:val="%8."/>
+      <w:lvlJc w:val="left"/>
+      <w:pPr>
+        <w:ind w:left="5760" w:hanging="360"/>
+      </w:pPr>
+    </w:lvl>
+    <w:lvl w:ilvl="8" w:tplc="0409001B" w:tentative="1">
+      <w:start w:val="1"/>
+      <w:numFmt w:val="lowerRoman"/>
+      <w:lvlText w:val="%9."/>
+      <w:lvlJc w:val="right"/>
+      <w:pPr>
+        <w:ind w:left="6480" w:hanging="180"/>
+      </w:pPr>
+    </w:lvl>
+  </w:abstractNum>
+  <w:abstractNum w:abstractNumId="2" w15:restartNumberingAfterBreak="0">
     <w:nsid w:val="48C90F01"/>
     <w:multiLevelType w:val="hybridMultilevel"/>
     <w:tmpl w:val="D786C3A2"/>
@@ -2939,7 +5054,7 @@
       </w:rPr>
     </w:lvl>
   </w:abstractNum>
-  <w:abstractNum w:abstractNumId="1" w15:restartNumberingAfterBreak="0">
+  <w:abstractNum w:abstractNumId="3" w15:restartNumberingAfterBreak="0">
     <w:nsid w:val="4F570979"/>
     <w:multiLevelType w:val="hybridMultilevel"/>
     <w:tmpl w:val="40AED34C"/>
@@ -3051,7 +5166,7 @@
       </w:rPr>
     </w:lvl>
   </w:abstractNum>
-  <w:abstractNum w:abstractNumId="2" w15:restartNumberingAfterBreak="0">
+  <w:abstractNum w:abstractNumId="4" w15:restartNumberingAfterBreak="0">
     <w:nsid w:val="5F760E52"/>
     <w:multiLevelType w:val="hybridMultilevel"/>
     <w:tmpl w:val="9D786ABE"/>
@@ -3141,13 +5256,19 @@
     </w:lvl>
   </w:abstractNum>
   <w:num w:numId="1" w16cid:durableId="328025048">
-    <w:abstractNumId w:val="0"/>
+    <w:abstractNumId w:val="2"/>
   </w:num>
   <w:num w:numId="2" w16cid:durableId="565385681">
+    <w:abstractNumId w:val="3"/>
+  </w:num>
+  <w:num w:numId="3" w16cid:durableId="1870410296">
+    <w:abstractNumId w:val="4"/>
+  </w:num>
+  <w:num w:numId="4" w16cid:durableId="1938362099">
     <w:abstractNumId w:val="1"/>
   </w:num>
-  <w:num w:numId="3" w16cid:durableId="1870410296">
-    <w:abstractNumId w:val="2"/>
+  <w:num w:numId="5" w16cid:durableId="1593930093">
+    <w:abstractNumId w:val="0"/>
   </w:num>
 </w:numbering>
 </file>
@@ -3820,6 +5941,25 @@
       <w:contextualSpacing/>
     </w:pPr>
   </w:style>
+  <w:style w:type="paragraph" w:styleId="Caption">
+    <w:name w:val="caption"/>
+    <w:basedOn w:val="Normal"/>
+    <w:next w:val="Normal"/>
+    <w:uiPriority w:val="35"/>
+    <w:unhideWhenUsed/>
+    <w:qFormat/>
+    <w:rsid w:val="00812B5C"/>
+    <w:pPr>
+      <w:spacing w:after="200" w:line="240" w:lineRule="auto"/>
+    </w:pPr>
+    <w:rPr>
+      <w:i/>
+      <w:iCs/>
+      <w:color w:val="44546A" w:themeColor="text2"/>
+      <w:sz w:val="18"/>
+      <w:szCs w:val="18"/>
+    </w:rPr>
+  </w:style>
 </w:styles>
 </file>
 

</xml_diff>